<commit_message>
Update descriptions, README files and the validity check (2026-10-03)
</commit_message>
<xml_diff>
--- a/Архетипи, инстанции и проверка на валидността.docx
+++ b/Архетипи, инстанции и проверка на валидността.docx
@@ -66,7 +66,7 @@
         <w:jc w:val="left"/>
       </w:pPr>
       <w:r>
-        <w:t xml:space="preserve">Файловете са публикувани с отворен достъп в хранилището github.com/SimeonAbanos/archetypes-phd под лиценз CC0 1.0. Проверката се пуска на компютър с Windows, без да се инсталира допълнителен софтуер. Начинът е описан в раздел 7.</w:t>
+        <w:t xml:space="preserve">Файловете са публикувани с отворен достъп в хранилището github.com/SimeonAbanos/archetypes-phd. Собствените са под лиценз CC0 1.0, а чуждите запазват лицензите си, посочени в NOTICE.md. Проверката се пуска на компютър с Windows, без да се инсталира допълнителен софтуер. Начинът е описан в раздел 7.</w:t>
       </w:r>
     </w:p>
     <w:p>
@@ -104,7 +104,7 @@
         <w:t xml:space="preserve">Референтен модел.</w:t>
       </w:r>
       <w:r>
-        <w:t xml:space="preserve"> Малък набор от общи класове и типове данни. Класовете са документ (Composition), раздел (Section), запис (Entry) и елемент (Element), а сред типовете данни е например физичната величина с мерна единица. Референтният модел е еднакъв за всички системи и не зависи от промените в клиничното знание.</w:t>
+        <w:t xml:space="preserve"> Малък набор от общи класове и типове данни. Основните класове са композиция (Composition), секция (Section), запис (Entry), група (Cluster) и елемент (Element), а сред типовете данни е например физичната величина с мерна единица. Референтният модел е еднакъв за всички системи и не зависи от промените в клиничното знание.</w:t>
       </w:r>
     </w:p>
     <w:p>
@@ -125,7 +125,7 @@
         <w:t xml:space="preserve">Архетип.</w:t>
       </w:r>
       <w:r>
-        <w:t xml:space="preserve"> Модел на едно клинично понятие, например телесното тегло, изразен като ограничения върху референтния модел. Архетипът определя от какви елементи се състои понятието, какви стойности са допустими и с кои кодове от международни номенклатури е свързано. Записва се на езика ADL (Archetype Definition Language) и може да се използва повторно в различни системи.</w:t>
+        <w:t xml:space="preserve"> Модел на едно клинично понятие, например телесното тегло, изразен като ограничения върху референтния модел. Архетипът определя от какви елементи се състои понятието, какви стойности са допустими и с кои кодове от международни номенклатури е свързано. Записва се на езика за дефиниране на архетипи (Archetype Definition Language – ADL) и може да се използва повторно в различни системи.</w:t>
       </w:r>
     </w:p>
     <w:p>
@@ -218,7 +218,7 @@
         <w:t xml:space="preserve">Семантична валидност.</w:t>
       </w:r>
       <w:r>
-        <w:t xml:space="preserve"> Стойностите в документа спазват ограниченията на архетипа или на шаблона. Теглото например трябва да е в килограми и в допустимия интервал, а единният граждански номер трябва да има десет цифри.</w:t>
+        <w:t xml:space="preserve"> Стойностите в документа спазват ограниченията на архетипа или на шаблона. Теглото например трябва да е в килограми и в допустимия интервал, а единният граждански номер (ЕГН) трябва да има десет цифри.</w:t>
       </w:r>
     </w:p>
     <w:p>
@@ -227,7 +227,7 @@
         <w:jc w:val="both"/>
       </w:pPr>
       <w:r>
-        <w:t xml:space="preserve">Двете нива се проверяват поотделно, защото XML схемата на референтния модел не носи сведения за конкретното клинично понятие. Документ с ръст 1780 cm или с деветцифрен ЕГН е правилен по структура, но е грешен по смисъл (семантично).</w:t>
+        <w:t xml:space="preserve">Обикновено двете нива се проверяват поотделно, защото XML схемата на референтния модел не носи сведения за конкретното клинично понятие. Документ с ръст 1780 cm или с деветцифрен ЕГН е правилен по структура, но е грешен по смисъл (семантично).</w:t>
       </w:r>
     </w:p>
     <w:p>
@@ -236,7 +236,7 @@
         <w:jc w:val="both"/>
       </w:pPr>
       <w:r>
-        <w:t xml:space="preserve">Двете рамки използват един и същ език за описание на архетипите – обектния модел на архетипите и ADL. Обектният модел и ADL са разработени от openEHR и са възприети от стандарта. Разликата между рамките е в предназначението им. EN ISO 13606 урежда обмена на извадки от електронното здравно досие между системи, а спецификациите openEHR обхващат целия жизнен цикъл на данните, включително съхранението им и заявките към тях.</w:t>
+        <w:t xml:space="preserve">Двете рамки описват архетипите по един и същ начин – с обектния модел на архетипите и с езика ADL. Обектният модел и ADL са разработени от openEHR и са възприети от стандарта. Разликата между рамките е в предназначението им. EN ISO 13606 урежда обмена на извадки от електронното здравно досие между системи, а спецификациите openEHR обхващат целия жизнен цикъл на данните, включително съхранението им и заявките към тях.</w:t>
       </w:r>
     </w:p>
     <w:p>
@@ -367,7 +367,7 @@
         <w:t xml:space="preserve">body_mass_index.v2</w:t>
       </w:r>
       <w:r>
-        <w:t xml:space="preserve"> от Clinical Knowledge Manager (CKM), международното хранилище на openEHR. Взети са от хранилището CKM-mirror в GitHub, което съдържа копие на CKM (github.com/openEHR/CKM-mirror, версия 5cb099f). Одобрените архетипи са прегледани от здравни специалисти и всяка система, която ги използва, разбира данните по един и същ начин. Затова нов модел се създава само когато няма подходящ публикуван.</w:t>
+        <w:t xml:space="preserve"> от международното хранилище за клинично знание на openEHR (Clinical Knowledge Manager – CKM). Взети са от хранилището CKM-mirror в GitHub, което съдържа копие на CKM (github.com/openEHR/CKM-mirror, версия 5cb099f). Одобрените архетипи са прегледани от здравни специалисти, а общият модел осигурява предпоставка системите, които ги използват, да тълкуват данните еднакво. Затова нов модел се създава само когато няма подходящ публикуван.</w:t>
       </w:r>
     </w:p>
     <w:p>
@@ -399,7 +399,7 @@
         <w:t xml:space="preserve">openEHR-EHR-COMPOSITION.anthropometry.v0</w:t>
       </w:r>
       <w:r>
-        <w:t xml:space="preserve">, който описва целия документ. Той съдържа по един слот за всяко от трите наблюдения. Слотът (archetype slot) е термин от спецификациите openEHR и означава място в архетипа, в което шаблонът поставя конкретен архетип.</w:t>
+        <w:t xml:space="preserve">, който описва целия документ. Той съдържа по един слот за всяко от трите наблюдения. Слотът (archetype slot) е понятие от обектния модел на архетипите и означава място в архетипа, в което шаблонът поставя конкретен архетип.</w:t>
       </w:r>
     </w:p>
     <w:p>
@@ -527,7 +527,7 @@
         <w:t xml:space="preserve">tds.py</w:t>
       </w:r>
       <w:r>
-        <w:t xml:space="preserve"> преобразува инстанцията от основния XML формат на openEHR във вида, който описва схемата от предходната стъпка. Инстанцията се извежда от шаблона, вместо да се пише на ръка, защото така следва точно неговата структура. Скриптовете и описанието на начина, по който се пускат, са в папката 3-instances/generation.</w:t>
+        <w:t xml:space="preserve"> преобразува инстанцията от общия XML вид на openEHR във вида, който описва схемата от предходната стъпка. Инстанцията се извежда от шаблона, вместо да се пише на ръка, защото така следва точно неговата структура. Скриптовете и описанието на начина, по който се пускат, са в папката 3-instances/generation.</w:t>
       </w:r>
     </w:p>
     <w:p>
@@ -595,7 +595,59 @@
         <w:jc w:val="both"/>
       </w:pPr>
       <w:r>
-        <w:t xml:space="preserve">Валидната инстанция минава и двете стъпки. Първото невалидно копие се отхвърля още в стъпка 1 (структурна валидност). Второто минава стъпка 1 и се отхвърля в стъпка 2 (семантична валидност), защото схемата приема всяко число, а стойността е извън интервала, който архетипът задава за ръста.</w:t>
+        <w:t>Валидната инстанция минава и двете стъпки. Първото невалидно копие се отхвърля още в стъпка 1 (структурна валидност). Второто минава стъпка 1 и се отхвърля в стъпка 2 (семантична валидност), защото схемата приема всяко число, а стойността е извън интервала, който архетипът задава за ръста (Фиг. 1).</w:t>
+      </w:r>
+    </w:p>
+    <w:p>
+      <w:pPr>
+        <w:keepNext/>
+        <w:spacing w:after="80" w:before="120"/>
+        <w:ind w:firstLine="0"/>
+        <w:jc w:val="center"/>
+      </w:pPr>
+      <w:r>
+        <w:drawing>
+          <wp:inline xmlns:a="http://schemas.openxmlformats.org/drawingml/2006/main" xmlns:pic="http://schemas.openxmlformats.org/drawingml/2006/picture">
+            <wp:extent cx="5760720" cy="3066619"/>
+            <wp:docPr id="1" name="Picture 1"/>
+            <wp:cNvGraphicFramePr>
+              <a:graphicFrameLocks noChangeAspect="1"/>
+            </wp:cNvGraphicFramePr>
+            <a:graphic>
+              <a:graphicData uri="http://schemas.openxmlformats.org/drawingml/2006/picture">
+                <pic:pic>
+                  <pic:nvPicPr>
+                    <pic:cNvPr id="0" name="Индекс на телесна маса – резултатът от validate-all за трите инстанции.png"/>
+                    <pic:cNvPicPr/>
+                  </pic:nvPicPr>
+                  <pic:blipFill>
+                    <a:blip r:embed="rId6"/>
+                    <a:stretch>
+                      <a:fillRect/>
+                    </a:stretch>
+                  </pic:blipFill>
+                  <pic:spPr>
+                    <a:xfrm>
+                      <a:off x="0" y="0"/>
+                      <a:ext cx="5760720" cy="3066619"/>
+                    </a:xfrm>
+                    <a:prstGeom prst="rect"/>
+                  </pic:spPr>
+                </pic:pic>
+              </a:graphicData>
+            </a:graphic>
+          </wp:inline>
+        </w:drawing>
+      </w:r>
+    </w:p>
+    <w:p>
+      <w:pPr>
+        <w:spacing w:after="240"/>
+        <w:ind w:firstLine="0"/>
+        <w:jc w:val="center"/>
+      </w:pPr>
+      <w:r>
+        <w:t>Фиг. 1. Резултатът от проверката на трите инстанции на индекса на телесна маса</w:t>
       </w:r>
     </w:p>
     <w:p>
@@ -642,7 +694,7 @@
         <w:jc w:val="both"/>
       </w:pPr>
       <w:r>
-        <w:t xml:space="preserve">Публикацията описва проверка спрямо TDS, изнесена от Template Designer. Тук TDS е изведена със скрипт и описва само структурата на шаблона.</w:t>
+        <w:t xml:space="preserve">Публикацията описва проверка спрямо TDS – XML схемата, до която се преобразува оперативният шаблон. Тук TDS е изведена със скрипт и описва само структурата на шаблона.</w:t>
       </w:r>
     </w:p>
     <w:p>
@@ -656,7 +708,7 @@
         <w:jc w:val="both"/>
       </w:pPr>
       <w:r>
-        <w:t xml:space="preserve">Публикацията зарежда в инстанциите реални данни и ги съхранява на openEHR сървър, откъдето те се извличат със заявки на езика AQL. Тук стойностите са примерни, а сървърът не е част от набора.</w:t>
+        <w:t xml:space="preserve">Публикацията зарежда в инстанциите реални данни и ги съхранява на openEHR сървър. Тук стойностите са примерни, а сървърът не е част от комплекта. Освен това публикацията обвързва теглото, ръста и индекса с кодове от SNOMED CT, а тук обвързванията са тези на архетипите в CKM – с LOINC за теглото и ръста и със SNOMED CT и LOINC за индекса.</w:t>
       </w:r>
     </w:p>
     <w:p>
@@ -682,7 +734,7 @@
         <w:jc w:val="both"/>
       </w:pPr>
       <w:r>
-        <w:t xml:space="preserve">Работник може да натрупа стаж и експозиция на вредни фактори в няколко държави. За профилактиката на професионалните заболявания е важно оценките да се предават между държавите, без да се губи смисълът им. На равнище ЕС няма стандарт за набора от данни на такова обобщение, а изискванията се различават по държави. Затова наборът е изведен от общите изисквания в законодателствата на Франция, България и Белгия. Моделът служи за обмен между системи и не повтаря един национален регистър.</w:t>
+        <w:t xml:space="preserve">Работник може да натрупа стаж и експозиция на вредни фактори в няколко държави. За профилактиката на професионалните заболявания е важно оценките да се предават между държавите, без да се губи смисълът им. На равнище ЕС няма стандарт за набора от данни на такова обобщение, а изискванията се различават по държави. Затова наборът е изведен от общите изисквания в законодателствата на Франция, България и Белгия. Моделът е предназначен за обмен между системи в различни държави.</w:t>
       </w:r>
     </w:p>
     <w:p>
@@ -741,7 +793,59 @@
         <w:t xml:space="preserve">Архетипът.</w:t>
       </w:r>
       <w:r>
-        <w:t xml:space="preserve"> Архетипът е изграден в средата LinkEHR Studio от клас Composition. Личните данни са запис (Entry), а трудовата история е раздел (Section) с подредени вложени раздели, по един за всяка заетост. Подредбата следва хронологията на трудовия път.</w:t>
+        <w:t xml:space="preserve"> Архетипът е изграден в средата LinkEHR Studio от клас Composition. Личните данни са запис (Entry), а трудовата история е секция (Section) с подредени вложени секции, по една за всяка заетост. Подредбата следва хронологията на трудовия път. LinkEHR Studio проверява архетипа спрямо референтния модел и спрямо типовете данни на референтния модел и на обектния модел на архетипите. Резултатът е „The archetype is valid“ (Фиг. 2).</w:t>
+      </w:r>
+    </w:p>
+    <w:p>
+      <w:pPr>
+        <w:keepNext/>
+        <w:spacing w:after="80" w:before="120"/>
+        <w:ind w:firstLine="0"/>
+        <w:jc w:val="center"/>
+      </w:pPr>
+      <w:r>
+        <w:drawing>
+          <wp:inline xmlns:a="http://schemas.openxmlformats.org/drawingml/2006/main" xmlns:pic="http://schemas.openxmlformats.org/drawingml/2006/picture">
+            <wp:extent cx="5760720" cy="4254137"/>
+            <wp:docPr id="2" name="Picture 2"/>
+            <wp:cNvGraphicFramePr>
+              <a:graphicFrameLocks noChangeAspect="1"/>
+            </wp:cNvGraphicFramePr>
+            <a:graphic>
+              <a:graphicData uri="http://schemas.openxmlformats.org/drawingml/2006/picture">
+                <pic:pic>
+                  <pic:nvPicPr>
+                    <pic:cNvPr id="0" name="OHAS проверка 2 – LinkEHR Studio потвърждава, че архетипът е валиден.png"/>
+                    <pic:cNvPicPr/>
+                  </pic:nvPicPr>
+                  <pic:blipFill>
+                    <a:blip r:embed="rId11"/>
+                    <a:stretch>
+                      <a:fillRect/>
+                    </a:stretch>
+                  </pic:blipFill>
+                  <pic:spPr>
+                    <a:xfrm>
+                      <a:off x="0" y="0"/>
+                      <a:ext cx="5760720" cy="4254137"/>
+                    </a:xfrm>
+                    <a:prstGeom prst="rect"/>
+                  </pic:spPr>
+                </pic:pic>
+              </a:graphicData>
+            </a:graphic>
+          </wp:inline>
+        </w:drawing>
+      </w:r>
+    </w:p>
+    <w:p>
+      <w:pPr>
+        <w:spacing w:after="240"/>
+        <w:ind w:firstLine="0"/>
+        <w:jc w:val="center"/>
+      </w:pPr>
+      <w:r>
+        <w:t>Фиг. 2. Архетипът на обобщението в LinkEHR Studio и резултатът от проверката му</w:t>
       </w:r>
     </w:p>
     <w:p>
@@ -783,7 +887,7 @@
         <w:t xml:space="preserve">Инстанцията без шаблон.</w:t>
       </w:r>
       <w:r>
-        <w:t xml:space="preserve"> В публикациите пътят по EN ISO 13606 минава без шаблон и без оперативен шаблон, защото стандартът ги въвежда едва с редакцията си от 2019 г. Затова валидната инстанция е изградена направо спрямо XML схемата на референтния модел </w:t>
+        <w:t xml:space="preserve"> В публикациите пътят по EN ISO 13606 минава без шаблон и без оперативен шаблон. Стандартът ги определя едва в редакцията си от 2019 г. Затова валидната инстанция е изградена направо спрямо XML схемата на референтния модел </w:t>
       </w:r>
       <w:r>
         <w:rPr>
@@ -847,7 +951,7 @@
         <w:t xml:space="preserve">Проверката.</w:t>
       </w:r>
       <w:r>
-        <w:t xml:space="preserve"> Стъпка 1 проверява структурната валидност спрямо двете схеми. Стъпка 2 проверява семантичната валидност. Тя чете от архетипа 32 ограничения на стойностите, от които 14 са регулярни изрази, а 18 са списъци с допустими стойности. С тях тя сравнява стойностите в инстанцията. Броят на срещанията на елементите и терминологичните обвързвания не се проверяват от скрипта. Първото невалидно копие е без задължителния идентификатор </w:t>
+        <w:t xml:space="preserve"> Стъпка 1 проверява структурната валидност спрямо двете схеми. Стъпка 2 проверява семантичната валидност. Тя сверява стойностите в инстанцията с ограниченията на архетипа – регулярните изрази и списъците с допустими стойности, типа на всяка стойност, кода и кодовата система при кодираните стойности, мерната единица и допустимия интервал при величините. Концентрацията на химичния агент във въздуха например е физична величина (PQ) в μg/m³ със стойност не по-малка от 0 (Фиг. 3). Извън проверката остават броят на срещанията на елементите и това дали кодът съществува в кодовата система. Първото невалидно копие е без задължителния идентификатор </w:t>
       </w:r>
       <w:r>
         <w:rPr>
@@ -863,6 +967,58 @@
     </w:p>
     <w:p>
       <w:pPr>
+        <w:keepNext/>
+        <w:spacing w:after="80" w:before="120"/>
+        <w:ind w:firstLine="0"/>
+        <w:jc w:val="center"/>
+      </w:pPr>
+      <w:r>
+        <w:drawing>
+          <wp:inline xmlns:a="http://schemas.openxmlformats.org/drawingml/2006/main" xmlns:pic="http://schemas.openxmlformats.org/drawingml/2006/picture">
+            <wp:extent cx="5760720" cy="4249783"/>
+            <wp:docPr id="3" name="Picture 3"/>
+            <wp:cNvGraphicFramePr>
+              <a:graphicFrameLocks noChangeAspect="1"/>
+            </wp:cNvGraphicFramePr>
+            <a:graphic>
+              <a:graphicData uri="http://schemas.openxmlformats.org/drawingml/2006/picture">
+                <pic:pic>
+                  <pic:nvPicPr>
+                    <pic:cNvPr id="0" name="OHAS проверка 3 – концентрацията във въздуха като PQ в ug-m3.png"/>
+                    <pic:cNvPicPr/>
+                  </pic:nvPicPr>
+                  <pic:blipFill>
+                    <a:blip r:embed="rId12"/>
+                    <a:stretch>
+                      <a:fillRect/>
+                    </a:stretch>
+                  </pic:blipFill>
+                  <pic:spPr>
+                    <a:xfrm>
+                      <a:off x="0" y="0"/>
+                      <a:ext cx="5760720" cy="4249783"/>
+                    </a:xfrm>
+                    <a:prstGeom prst="rect"/>
+                  </pic:spPr>
+                </pic:pic>
+              </a:graphicData>
+            </a:graphic>
+          </wp:inline>
+        </w:drawing>
+      </w:r>
+    </w:p>
+    <w:p>
+      <w:pPr>
+        <w:spacing w:after="240"/>
+        <w:ind w:firstLine="0"/>
+        <w:jc w:val="center"/>
+      </w:pPr>
+      <w:r>
+        <w:t>Фиг. 3. Концентрацията на химичния агент във въздуха – PQ в μg/m³</w:t>
+      </w:r>
+    </w:p>
+    <w:p>
+      <w:pPr>
         <w:pStyle w:val="ListParagraph"/>
         <w:numPr>
           <w:ilvl w:val="0"/>
@@ -879,7 +1035,7 @@
         <w:t xml:space="preserve">Актуализациите.</w:t>
       </w:r>
       <w:r>
-        <w:t xml:space="preserve"> Публикуваните инстанции минават стъпка 1, но част от стойностите им не спазват ограниченията на архетипа и стъпка 2 ги отхвърля. Копието в archetypes-phd съдържа актуализации, с които и трите публикувани инстанции минават двете стъпки. В архетипа регулярните изрази за фамилното име и за общината приемат една или повече думи. Девет елемента, които допускаха като стойност само описанието си, приемат всеки текст, а една печатна грешка в име на възел е поправена. В инстанциите са премахнати излишни знаци пред общината и пред ЕГН, отговорите „да“ и „не“ са записани като 1 и 0, работното време е взето от списъка на архетипа и са поправени няколко печатни грешки. Същите актуализации са подготвени и за публикуваното хранилище. За публикуваната версия меродавно остава оригиналното хранилище.</w:t>
+        <w:t xml:space="preserve"> Копието в archetypes-phd съдържа актуализации, с които трите публикувани инстанции минават двете стъпки. В архетипа фамилното име и общината приемат една или повече думи, девет текстови елемента – свободен текст, температурата – всяка стойност, а влажността – стойност от 0 до 100 %. Химичните агенти имат код по CAS като кодирана стойност (CV) и концентрация във въздуха като физична величина (PQ). Картата от предварителните прегледи има група за биологичен мониторинг, в която резултатът е PQ, а референтната граница – интервал (IVLPQ). В инстанциите общината и ЕГН съдържат само стойността си, отговорите „да“ и „не“ са записани като 1 и 0, работното време е от списъка на архетипа, а диагнозите са кодирани стойности (CV) по МКБ‑10. С тези типове данни са записани и стойностите от казуса – кодът на оловото по CAS, концентрацията му във въздуха и нивата в кръвта и в урината заедно с горните им граници. Същите актуализации са подготвени и за публикуваното хранилище. За публикуваната версия меродавно остава оригиналното хранилище.</w:t>
       </w:r>
     </w:p>
     <w:p>
@@ -900,7 +1056,7 @@
         <w:t xml:space="preserve">Реализацията.</w:t>
       </w:r>
       <w:r>
-        <w:t xml:space="preserve"> В публикациите инстанциите се съхраняват в специализираната XML база от данни BaseX. Достъпът до тях е чрез XQuery през RESTful уеб услуги на уеб сървър Apache, а клиентът е настолно приложение на Windows Presentation Foundation. Стандартът няма собствен език за заявки към архетипи и XQuery заема мястото му. Пътищата в архетипа не се променят, поради което върху тях е изграден стабилен програмен интерфейс. Реализацията не е част от набора за проверка.</w:t>
+        <w:t xml:space="preserve"> В публикациите инстанциите се съхраняват в специализираната XML база от данни BaseX. Достъпът до тях е чрез XQuery през RESTful уеб услуги на уеб сървър Apache, а клиентът е настолно приложение на Windows Presentation Foundation. Стандартът няма собствен език за заявки към архетипи и XQuery заема мястото му. Пътищата в архетипа не се променят, поради което върху тях е изграден стабилен програмен интерфейс. Реализацията не е част от комплекта.</w:t>
       </w:r>
     </w:p>
     <w:p>
@@ -909,6 +1065,15 @@
       </w:pPr>
       <w:r>
         <w:t xml:space="preserve">Резултат</w:t>
+      </w:r>
+    </w:p>
+    <w:p>
+      <w:pPr>
+        <w:spacing w:after="120"/>
+        <w:jc w:val="both"/>
+      </w:pPr>
+      <w:r>
+        <w:t>LinkEHR Studio 1.0.20240603 потвърждава, че архетипът е валиден (Фиг. 2).</w:t>
       </w:r>
     </w:p>
     <w:p>
@@ -928,16 +1093,59 @@
         <w:t xml:space="preserve">rc_id</w:t>
       </w:r>
       <w:r>
-        <w:t xml:space="preserve"> се отхвърля в стъпка 1 (структурна валидност), а копието с деветцифрен ЕГН – в стъпка 2 (семантична валидност).</w:t>
-      </w:r>
-    </w:p>
-    <w:p>
-      <w:pPr>
-        <w:spacing w:after="120"/>
-        <w:jc w:val="both"/>
-      </w:pPr>
-      <w:r>
-        <w:t xml:space="preserve">Инстанциите служат за проверка на валидността, а не за описание на казуса. В свободния им текст стойността 0.25 μmol/L е отнесена към кръвта, докато в публикацията тя е за урината. Меродавни са числата в публикацията.</w:t>
+        <w:t xml:space="preserve"> се отхвърля в стъпка 1 (структурна валидност), а копието с деветцифрен ЕГН – в стъпка 2 (семантична валидност), както показва Фиг. 4.</w:t>
+      </w:r>
+    </w:p>
+    <w:p>
+      <w:pPr>
+        <w:keepNext/>
+        <w:spacing w:after="80" w:before="120"/>
+        <w:ind w:firstLine="0"/>
+        <w:jc w:val="center"/>
+      </w:pPr>
+      <w:r>
+        <w:drawing>
+          <wp:inline xmlns:a="http://schemas.openxmlformats.org/drawingml/2006/main" xmlns:pic="http://schemas.openxmlformats.org/drawingml/2006/picture">
+            <wp:extent cx="5760720" cy="3071940"/>
+            <wp:docPr id="4" name="Picture 4"/>
+            <wp:cNvGraphicFramePr>
+              <a:graphicFrameLocks noChangeAspect="1"/>
+            </wp:cNvGraphicFramePr>
+            <a:graphic>
+              <a:graphicData uri="http://schemas.openxmlformats.org/drawingml/2006/picture">
+                <pic:pic>
+                  <pic:nvPicPr>
+                    <pic:cNvPr id="0" name="OHAS проверка 7 – резултатът от validate-all за петте инстанции.png"/>
+                    <pic:cNvPicPr/>
+                  </pic:nvPicPr>
+                  <pic:blipFill>
+                    <a:blip r:embed="rId13"/>
+                    <a:stretch>
+                      <a:fillRect/>
+                    </a:stretch>
+                  </pic:blipFill>
+                  <pic:spPr>
+                    <a:xfrm>
+                      <a:off x="0" y="0"/>
+                      <a:ext cx="5760720" cy="3071940"/>
+                    </a:xfrm>
+                    <a:prstGeom prst="rect"/>
+                  </pic:spPr>
+                </pic:pic>
+              </a:graphicData>
+            </a:graphic>
+          </wp:inline>
+        </w:drawing>
+      </w:r>
+    </w:p>
+    <w:p>
+      <w:pPr>
+        <w:spacing w:after="240"/>
+        <w:ind w:firstLine="0"/>
+        <w:jc w:val="center"/>
+      </w:pPr>
+      <w:r>
+        <w:t>Фиг. 4. Резултатът от проверката на петте инстанции на обобщението</w:t>
       </w:r>
     </w:p>
     <w:p>
@@ -1022,7 +1230,7 @@
         <w:t xml:space="preserve">Архетипът.</w:t>
       </w:r>
       <w:r>
-        <w:t xml:space="preserve"> Архетипът е от клас Composition, написан е на ADL и има четири раздела (Section), всеки с един запис (Entry). Записът за класификацията съдържа класа, правилото, по което е определен, датата и основанията за него. Всеки отбелязан критерий е отделен клъстер със своята категория, номер и текст. Поне едно основание е задължително, затова клас на случая без основание не може да бъде записан. LinkEHR Studio 1.0.20240603 отваря архетипа без грешки.</w:t>
+        <w:t xml:space="preserve"> Архетипът е от клас Composition, написан е на ADL и има четири секции (Section), всяка с един запис (Entry). Записът за класификацията съдържа класа, правилото, по което е определен, датата и основанията за него. Всеки отбелязан критерий е отделна група със своята категория, номер и текст. Поне едно основание е задължително, затова клас на случая без основание не може да бъде записан. LinkEHR Studio 1.0.20240603 отваря архетипа без грешки.</w:t>
       </w:r>
     </w:p>
     <w:p>
@@ -1106,7 +1314,59 @@
         <w:t xml:space="preserve">Проверката.</w:t>
       </w:r>
       <w:r>
-        <w:t xml:space="preserve"> Валидната инстанция е износ на известие за потвърден случай на скарлатина с демонстрационни данни за лицето. Първото невалидно копие съдържа датата като 17.04.2026, докато типът данни изисква 2026-04-17, и се отхвърля на структурно ниво. Второто обявява класа на случая по Приложение № 1 вместо по Приложение № 2. Структурата му е непроменена, но проверката го отхвърля на семантично ниво.</w:t>
+        <w:t xml:space="preserve"> Валидната инстанция е износ на известие за потвърден случай на скарлатина с демонстрационни данни за лицето. Първото невалидно копие съдържа датата като 17.04.2026, докато типът данни изисква 2026-04-17, и се отхвърля на структурно ниво. Второто обявява класа на случая по Приложение № 1 вместо по Приложение № 2. Структурата му е непроменена, но проверката го отхвърля на семантично ниво (Фиг. 5).</w:t>
+      </w:r>
+    </w:p>
+    <w:p>
+      <w:pPr>
+        <w:keepNext/>
+        <w:spacing w:after="80" w:before="120"/>
+        <w:ind w:firstLine="0"/>
+        <w:jc w:val="center"/>
+      </w:pPr>
+      <w:r>
+        <w:drawing>
+          <wp:inline xmlns:a="http://schemas.openxmlformats.org/drawingml/2006/main" xmlns:pic="http://schemas.openxmlformats.org/drawingml/2006/picture">
+            <wp:extent cx="5760720" cy="3068608"/>
+            <wp:docPr id="5" name="Picture 5"/>
+            <wp:cNvGraphicFramePr>
+              <a:graphicFrameLocks noChangeAspect="1"/>
+            </wp:cNvGraphicFramePr>
+            <a:graphic>
+              <a:graphicData uri="http://schemas.openxmlformats.org/drawingml/2006/picture">
+                <pic:pic>
+                  <pic:nvPicPr>
+                    <pic:cNvPr id="0" name="Бързо известие – резултатът от validate-all за трите инстанции.png"/>
+                    <pic:cNvPicPr/>
+                  </pic:nvPicPr>
+                  <pic:blipFill>
+                    <a:blip r:embed="rId14"/>
+                    <a:stretch>
+                      <a:fillRect/>
+                    </a:stretch>
+                  </pic:blipFill>
+                  <pic:spPr>
+                    <a:xfrm>
+                      <a:off x="0" y="0"/>
+                      <a:ext cx="5760720" cy="3068608"/>
+                    </a:xfrm>
+                    <a:prstGeom prst="rect"/>
+                  </pic:spPr>
+                </pic:pic>
+              </a:graphicData>
+            </a:graphic>
+          </wp:inline>
+        </w:drawing>
+      </w:r>
+    </w:p>
+    <w:p>
+      <w:pPr>
+        <w:spacing w:after="240"/>
+        <w:ind w:firstLine="0"/>
+        <w:jc w:val="center"/>
+      </w:pPr>
+      <w:r>
+        <w:t>Фиг. 5. Резултатът от проверката на трите инстанции на бързото известие</w:t>
       </w:r>
     </w:p>
     <w:p>
@@ -2009,7 +2269,7 @@
                 <w:sz w:val="21"/>
                 <w:szCs w:val="21"/>
               </w:rPr>
-              <w:t xml:space="preserve">32 ограничения, прочетени от архетипа</w:t>
+              <w:t>ограниченията в архетипа</w:t>
             </w:r>
           </w:p>
         </w:tc>
@@ -2185,7 +2445,7 @@
         <w:jc w:val="left"/>
       </w:pPr>
       <w:r>
-        <w:t xml:space="preserve">Отворете github.com/SimeonAbanos/archetypes-phd, натиснете бутона Code, изберете Download ZIP и разархивирайте файла.</w:t>
+        <w:t xml:space="preserve">Хранилището се изтегля от github.com/SimeonAbanos/archetypes-phd с бутона Code → Download ZIP и се разархивира.</w:t>
       </w:r>
     </w:p>
     <w:p>
@@ -2213,7 +2473,7 @@
         <w:jc w:val="left"/>
       </w:pPr>
       <w:r>
-        <w:t xml:space="preserve">Отворете 4-validity-check и щракнете двукратно върху validate-all.cmd. Файлът пуска скрипта validate.ps1 с Windows PowerShell, който е част от Windows. Не се инсталира нищо, а скриптът само чете файловете и не ги променя.</w:t>
+        <w:t xml:space="preserve">В папката 4-validity-check се щраква двукратно върху validate-all.cmd. Файлът пуска скрипта validate.ps1 с Windows PowerShell, който е част от Windows. Не се инсталира нищо, а скриптът само чете файловете и не ги променя.</w:t>
       </w:r>
     </w:p>
     <w:p>
@@ -2227,7 +2487,7 @@
         <w:jc w:val="both"/>
       </w:pPr>
       <w:r>
-        <w:t xml:space="preserve">Прозорецът показва за всяка инстанция резултата от всяка стъпка и дали той съвпада с очаквания. Очакваният резултат се чете от името на файла – instance-valid, instance-invalid-structural-rm или instance-invalid-semantic-archetype. Накрая се извежда обобщение, например „3 instances: 1 valid in both steps, 2 invalid.“ и „All results are as expected from the file names.“</w:t>
+        <w:t>Прозорецът показва за всяка инстанция резултата от всяка стъпка и дали той съвпада с очаквания. Очакваният резултат се чете от името на файла – instance-valid, instance-invalid-structural-rm или instance-invalid-semantic-archetype. Накрая се извежда обобщение, например „3 instances: 1 valid in both steps, 2 invalid.“ и „All results are as expected from the file names.“ Такива прозорци са показани на Фиг. 1, 4 и 5.</w:t>
       </w:r>
     </w:p>
     <w:p>
@@ -2328,7 +2588,7 @@
         <w:jc w:val="left"/>
       </w:pPr>
       <w:r>
-        <w:t xml:space="preserve">github.com/SimeonAbanos/archetypes-phd – наборите за проверка към дисертационния труд, лиценз CC0 1.0.</w:t>
+        <w:t xml:space="preserve">github.com/SimeonAbanos/archetypes-phd – комплектите с проверка към дисертационния труд, лиценз CC0 1.0.</w:t>
       </w:r>
     </w:p>
     <w:p>

</xml_diff>

<commit_message>
Align the description document with the thesis layout
</commit_message>
<xml_diff>
--- a/Архетипи, инстанции и проверка на валидността.docx
+++ b/Архетипи, инстанции и проверка на валидността.docx
@@ -4,29 +4,17 @@
   <w:body>
     <w:p>
       <w:pPr>
-        <w:spacing w:after="120"/>
-        <w:jc w:val="center"/>
-      </w:pPr>
-      <w:r>
-        <w:rPr>
-          <w:b/>
-          <w:bCs/>
-          <w:sz w:val="32"/>
-          <w:szCs w:val="32"/>
-        </w:rPr>
+        <w:pStyle w:val="Title"/>
+      </w:pPr>
+      <w:r>
         <w:t xml:space="preserve">Архетипи, инстанции и проверка на валидността</w:t>
       </w:r>
     </w:p>
     <w:p>
       <w:pPr>
-        <w:spacing w:after="80"/>
-        <w:jc w:val="center"/>
-      </w:pPr>
-      <w:r>
-        <w:rPr>
-          <w:i/>
-          <w:iCs/>
-        </w:rPr>
+        <w:pStyle w:val="Subtitle"/>
+      </w:pPr>
+      <w:r>
         <w:t xml:space="preserve">Описание на моделите към дисертационния труд „Моделиране и управление на клинични данни, ориентирани към архетипи“</w:t>
       </w:r>
     </w:p>
@@ -53,7 +41,6 @@
     </w:p>
     <w:p>
       <w:pPr>
-        <w:spacing w:after="120"/>
         <w:jc w:val="both"/>
       </w:pPr>
       <w:r>
@@ -62,7 +49,6 @@
     </w:p>
     <w:p>
       <w:pPr>
-        <w:spacing w:after="120"/>
         <w:jc w:val="left"/>
       </w:pPr>
       <w:r>
@@ -90,7 +76,6 @@
     </w:p>
     <w:p>
       <w:pPr>
-        <w:spacing w:after="120"/>
         <w:jc w:val="both"/>
       </w:pPr>
       <w:r>
@@ -110,8 +95,6 @@
           <w:ilvl w:val="0"/>
           <w:numId w:val="2"/>
         </w:numPr>
-        <w:spacing w:after="80"/>
-        <w:jc w:val="both"/>
       </w:pPr>
       <w:r>
         <w:rPr>
@@ -131,8 +114,6 @@
           <w:ilvl w:val="0"/>
           <w:numId w:val="2"/>
         </w:numPr>
-        <w:spacing w:after="80"/>
-        <w:jc w:val="both"/>
       </w:pPr>
       <w:r>
         <w:rPr>
@@ -152,8 +133,6 @@
           <w:ilvl w:val="0"/>
           <w:numId w:val="2"/>
         </w:numPr>
-        <w:spacing w:after="80"/>
-        <w:jc w:val="both"/>
       </w:pPr>
       <w:r>
         <w:rPr>
@@ -173,8 +152,6 @@
           <w:ilvl w:val="0"/>
           <w:numId w:val="2"/>
         </w:numPr>
-        <w:spacing w:after="80"/>
-        <w:jc w:val="both"/>
       </w:pPr>
       <w:r>
         <w:rPr>
@@ -189,7 +166,6 @@
     </w:p>
     <w:p>
       <w:pPr>
-        <w:spacing w:after="120"/>
         <w:jc w:val="both"/>
       </w:pPr>
       <w:r>
@@ -198,7 +174,6 @@
     </w:p>
     <w:p>
       <w:pPr>
-        <w:spacing w:after="120"/>
         <w:jc w:val="both"/>
       </w:pPr>
       <w:r>
@@ -212,8 +187,6 @@
           <w:ilvl w:val="0"/>
           <w:numId w:val="2"/>
         </w:numPr>
-        <w:spacing w:after="80"/>
-        <w:jc w:val="both"/>
       </w:pPr>
       <w:r>
         <w:rPr>
@@ -233,8 +206,6 @@
           <w:ilvl w:val="0"/>
           <w:numId w:val="2"/>
         </w:numPr>
-        <w:spacing w:after="80"/>
-        <w:jc w:val="both"/>
       </w:pPr>
       <w:r>
         <w:rPr>
@@ -249,7 +220,6 @@
     </w:p>
     <w:p>
       <w:pPr>
-        <w:spacing w:after="120"/>
         <w:jc w:val="both"/>
       </w:pPr>
       <w:r>
@@ -258,7 +228,6 @@
     </w:p>
     <w:p>
       <w:pPr>
-        <w:spacing w:after="120"/>
         <w:jc w:val="both"/>
       </w:pPr>
       <w:r>
@@ -283,7 +252,6 @@
     </w:p>
     <w:p>
       <w:pPr>
-        <w:spacing w:after="120"/>
         <w:jc w:val="both"/>
       </w:pPr>
       <w:r>
@@ -297,9 +265,7 @@
       </w:r>
       <w:r>
         <w:rPr>
-          <w:rFonts w:ascii="Consolas" w:cs="Consolas" w:eastAsia="Consolas" w:hAnsi="Consolas"/>
-          <w:sz w:val="21"/>
-          <w:szCs w:val="21"/>
+          <w:rStyle w:val="InlineCode"/>
         </w:rPr>
         <w:t xml:space="preserve"/>
       </w:r>
@@ -308,9 +274,7 @@
       </w:r>
       <w:r>
         <w:rPr>
-          <w:rFonts w:ascii="Consolas" w:cs="Consolas" w:eastAsia="Consolas" w:hAnsi="Consolas"/>
-          <w:sz w:val="21"/>
-          <w:szCs w:val="21"/>
+          <w:rStyle w:val="InlineCode"/>
         </w:rPr>
         <w:t xml:space="preserve"/>
       </w:r>
@@ -320,7 +284,6 @@
     </w:p>
     <w:p>
       <w:pPr>
-        <w:spacing w:after="120"/>
         <w:jc w:val="both"/>
       </w:pPr>
       <w:r>
@@ -342,8 +305,6 @@
           <w:ilvl w:val="0"/>
           <w:numId w:val="3"/>
         </w:numPr>
-        <w:spacing w:after="100"/>
-        <w:jc w:val="left"/>
       </w:pPr>
       <w:r>
         <w:rPr>
@@ -357,9 +318,7 @@
       </w:r>
       <w:r>
         <w:rPr>
-          <w:rFonts w:ascii="Consolas" w:cs="Consolas" w:eastAsia="Consolas" w:hAnsi="Consolas"/>
-          <w:sz w:val="21"/>
-          <w:szCs w:val="21"/>
+          <w:rStyle w:val="InlineCode"/>
         </w:rPr>
         <w:t xml:space="preserve">body_weight.v2</w:t>
       </w:r>
@@ -368,9 +327,7 @@
       </w:r>
       <w:r>
         <w:rPr>
-          <w:rFonts w:ascii="Consolas" w:cs="Consolas" w:eastAsia="Consolas" w:hAnsi="Consolas"/>
-          <w:sz w:val="21"/>
-          <w:szCs w:val="21"/>
+          <w:rStyle w:val="InlineCode"/>
         </w:rPr>
         <w:t xml:space="preserve">height.v2</w:t>
       </w:r>
@@ -379,9 +336,7 @@
       </w:r>
       <w:r>
         <w:rPr>
-          <w:rFonts w:ascii="Consolas" w:cs="Consolas" w:eastAsia="Consolas" w:hAnsi="Consolas"/>
-          <w:sz w:val="21"/>
-          <w:szCs w:val="21"/>
+          <w:rStyle w:val="InlineCode"/>
         </w:rPr>
         <w:t xml:space="preserve">body_mass_index.v2</w:t>
       </w:r>
@@ -396,8 +351,6 @@
           <w:ilvl w:val="0"/>
           <w:numId w:val="3"/>
         </w:numPr>
-        <w:spacing w:after="100"/>
-        <w:jc w:val="both"/>
       </w:pPr>
       <w:r>
         <w:rPr>
@@ -411,9 +364,7 @@
       </w:r>
       <w:r>
         <w:rPr>
-          <w:rFonts w:ascii="Consolas" w:cs="Consolas" w:eastAsia="Consolas" w:hAnsi="Consolas"/>
-          <w:sz w:val="21"/>
-          <w:szCs w:val="21"/>
+          <w:rStyle w:val="InlineCode"/>
         </w:rPr>
         <w:t xml:space="preserve">openEHR-EHR-COMPOSITION.anthropometry.v0</w:t>
       </w:r>
@@ -428,8 +379,6 @@
           <w:ilvl w:val="0"/>
           <w:numId w:val="3"/>
         </w:numPr>
-        <w:spacing w:after="100"/>
-        <w:jc w:val="both"/>
       </w:pPr>
       <w:r>
         <w:rPr>
@@ -443,9 +392,7 @@
       </w:r>
       <w:r>
         <w:rPr>
-          <w:rFonts w:ascii="Consolas" w:cs="Consolas" w:eastAsia="Consolas" w:hAnsi="Consolas"/>
-          <w:sz w:val="21"/>
-          <w:szCs w:val="21"/>
+          <w:rStyle w:val="InlineCode"/>
         </w:rPr>
         <w:t xml:space="preserve">anthropometric_measurements.en.v0</w:t>
       </w:r>
@@ -460,8 +407,6 @@
           <w:ilvl w:val="0"/>
           <w:numId w:val="3"/>
         </w:numPr>
-        <w:spacing w:after="100"/>
-        <w:jc w:val="both"/>
       </w:pPr>
       <w:r>
         <w:rPr>
@@ -481,8 +426,6 @@
           <w:ilvl w:val="0"/>
           <w:numId w:val="3"/>
         </w:numPr>
-        <w:spacing w:after="100"/>
-        <w:jc w:val="both"/>
       </w:pPr>
       <w:r>
         <w:rPr>
@@ -496,9 +439,7 @@
       </w:r>
       <w:r>
         <w:rPr>
-          <w:rFonts w:ascii="Consolas" w:cs="Consolas" w:eastAsia="Consolas" w:hAnsi="Consolas"/>
-          <w:sz w:val="21"/>
-          <w:szCs w:val="21"/>
+          <w:rStyle w:val="InlineCode"/>
         </w:rPr>
         <w:t xml:space="preserve">tds.py</w:t>
       </w:r>
@@ -513,8 +454,6 @@
           <w:ilvl w:val="0"/>
           <w:numId w:val="3"/>
         </w:numPr>
-        <w:spacing w:after="100"/>
-        <w:jc w:val="left"/>
       </w:pPr>
       <w:r>
         <w:rPr>
@@ -528,9 +467,7 @@
       </w:r>
       <w:r>
         <w:rPr>
-          <w:rFonts w:ascii="Consolas" w:cs="Consolas" w:eastAsia="Consolas" w:hAnsi="Consolas"/>
-          <w:sz w:val="21"/>
-          <w:szCs w:val="21"/>
+          <w:rStyle w:val="InlineCode"/>
         </w:rPr>
         <w:t xml:space="preserve">fill.py</w:t>
       </w:r>
@@ -539,9 +476,7 @@
       </w:r>
       <w:r>
         <w:rPr>
-          <w:rFonts w:ascii="Consolas" w:cs="Consolas" w:eastAsia="Consolas" w:hAnsi="Consolas"/>
-          <w:sz w:val="21"/>
-          <w:szCs w:val="21"/>
+          <w:rStyle w:val="InlineCode"/>
         </w:rPr>
         <w:t xml:space="preserve">tds.py</w:t>
       </w:r>
@@ -556,8 +491,6 @@
           <w:ilvl w:val="0"/>
           <w:numId w:val="3"/>
         </w:numPr>
-        <w:spacing w:after="100"/>
-        <w:jc w:val="both"/>
       </w:pPr>
       <w:r>
         <w:rPr>
@@ -577,8 +510,6 @@
           <w:ilvl w:val="0"/>
           <w:numId w:val="3"/>
         </w:numPr>
-        <w:spacing w:after="100"/>
-        <w:jc w:val="both"/>
       </w:pPr>
       <w:r>
         <w:rPr>
@@ -601,7 +532,6 @@
     </w:p>
     <w:p>
       <w:pPr>
-        <w:spacing w:after="120"/>
         <w:jc w:val="both"/>
       </w:pPr>
       <w:r>
@@ -616,10 +546,7 @@
     </w:p>
     <w:p>
       <w:pPr>
-        <w:keepNext/>
-        <w:spacing w:after="80" w:before="120"/>
-        <w:ind w:firstLine="0"/>
-        <w:jc w:val="center"/>
+        <w:pStyle w:val="Figure"/>
       </w:pPr>
       <w:r>
         <w:drawing>
@@ -658,9 +585,7 @@
     </w:p>
     <w:p>
       <w:pPr>
-        <w:spacing w:after="240"/>
-        <w:ind w:firstLine="0"/>
-        <w:jc w:val="center"/>
+        <w:pStyle w:val="FigureCaption"/>
       </w:pPr>
       <w:r>
         <w:t>Фиг. 1. Резултатът от проверката на трите инстанции на индекса на телесна маса</w:t>
@@ -681,81 +606,70 @@
           <w:ilvl w:val="0"/>
           <w:numId w:val="2"/>
         </w:numPr>
-        <w:spacing w:after="80"/>
+      </w:pPr>
+      <w:r>
+        <w:t xml:space="preserve">В публикацията архетипът за ръст е изграден по образеца на архетипа за тегло. Тук е използван одобреният в CKM архетип </w:t>
+      </w:r>
+      <w:r>
+        <w:rPr>
+          <w:rStyle w:val="InlineCode"/>
+        </w:rPr>
+        <w:t xml:space="preserve">height.v2</w:t>
+      </w:r>
+      <w:r>
+        <w:t xml:space="preserve"> без промяна.</w:t>
+      </w:r>
+    </w:p>
+    <w:p>
+      <w:pPr>
+        <w:pStyle w:val="ListParagraph"/>
+        <w:numPr>
+          <w:ilvl w:val="0"/>
+          <w:numId w:val="2"/>
+        </w:numPr>
+      </w:pPr>
+      <w:r>
+        <w:t xml:space="preserve">Публикацията посочва като възможност проверка спрямо XML схемата, до която се преобразува оперативният шаблон. Тук схемата е изведена със скрипт и описва само структурата на шаблона.</w:t>
+      </w:r>
+    </w:p>
+    <w:p>
+      <w:pPr>
+        <w:pStyle w:val="ListParagraph"/>
+        <w:numPr>
+          <w:ilvl w:val="0"/>
+          <w:numId w:val="2"/>
+        </w:numPr>
+      </w:pPr>
+      <w:r>
+        <w:t xml:space="preserve">Публикацията зарежда в инстанциите реални данни и ги съхранява на openEHR сървър. Тук стойностите са примерни, а сървърът не е част от хранилището. Освен това публикацията обвързва теглото, ръста и индекса с кодове от SNOMED CT. Тук обвързванията са тези на архетипите в CKM – с LOINC за теглото и ръста и със SNOMED CT и LOINC за индекса.</w:t>
+      </w:r>
+    </w:p>
+    <w:p>
+      <w:pPr>
+        <w:pStyle w:val="Heading2"/>
+      </w:pPr>
+      <w:r>
+        <w:t xml:space="preserve">3.2. Обобщение на оценката на професионалното здраве (EN ISO 13606) [П2], [СП1]</w:t>
+      </w:r>
+    </w:p>
+    <w:p>
+      <w:pPr>
         <w:jc w:val="both"/>
       </w:pPr>
       <w:r>
-        <w:t xml:space="preserve">В публикацията архетипът за ръст е изграден по образеца на архетипа за тегло. Тук е използван одобреният в CKM архетип </w:t>
-      </w:r>
-      <w:r>
-        <w:rPr>
-          <w:rFonts w:ascii="Consolas" w:cs="Consolas" w:eastAsia="Consolas" w:hAnsi="Consolas"/>
-          <w:sz w:val="21"/>
-          <w:szCs w:val="21"/>
-        </w:rPr>
-        <w:t xml:space="preserve">height.v2</w:t>
-      </w:r>
-      <w:r>
-        <w:t xml:space="preserve"> без промяна.</w:t>
-      </w:r>
-    </w:p>
-    <w:p>
-      <w:pPr>
-        <w:pStyle w:val="ListParagraph"/>
-        <w:numPr>
-          <w:ilvl w:val="0"/>
-          <w:numId w:val="2"/>
-        </w:numPr>
-        <w:spacing w:after="80"/>
+        <w:t xml:space="preserve">Моделът описва обобщението на оценката на професионалното здраве (Occupational Health Assessment Summary – OHAS), което събира медицинските оценки от трудовия път на работника. Обобщението свързва всяка оценка с работното място, с вредните фактори, на които работникът е бил изложен там, и със заключението за годност.</w:t>
+      </w:r>
+    </w:p>
+    <w:p>
+      <w:pPr>
         <w:jc w:val="both"/>
       </w:pPr>
       <w:r>
-        <w:t xml:space="preserve">Публикацията посочва като възможност проверка спрямо XML схемата, до която се преобразува оперативният шаблон. Тук схемата е изведена със скрипт и описва само структурата на шаблона.</w:t>
-      </w:r>
-    </w:p>
-    <w:p>
-      <w:pPr>
-        <w:pStyle w:val="ListParagraph"/>
-        <w:numPr>
-          <w:ilvl w:val="0"/>
-          <w:numId w:val="2"/>
-        </w:numPr>
-        <w:spacing w:after="80"/>
-        <w:jc w:val="both"/>
-      </w:pPr>
-      <w:r>
-        <w:t xml:space="preserve">Публикацията зарежда в инстанциите реални данни и ги съхранява на openEHR сървър. Тук стойностите са примерни, а сървърът не е част от хранилището. Освен това публикацията обвързва теглото, ръста и индекса с кодове от SNOMED CT. Тук обвързванията са тези на архетипите в CKM – с LOINC за теглото и ръста и със SNOMED CT и LOINC за индекса.</w:t>
-      </w:r>
-    </w:p>
-    <w:p>
-      <w:pPr>
-        <w:pStyle w:val="Heading2"/>
-      </w:pPr>
-      <w:r>
-        <w:t xml:space="preserve">3.2. Обобщение на оценката на професионалното здраве (EN ISO 13606) [П2], [СП1]</w:t>
-      </w:r>
-    </w:p>
-    <w:p>
-      <w:pPr>
-        <w:spacing w:after="120"/>
-        <w:jc w:val="both"/>
-      </w:pPr>
-      <w:r>
-        <w:t xml:space="preserve">Моделът описва обобщението на оценката на професионалното здраве (Occupational Health Assessment Summary – OHAS), което събира медицинските оценки от трудовия път на работника. Обобщението свързва всяка оценка с работното място, с вредните фактори, на които работникът е бил изложен там, и със заключението за годност.</w:t>
-      </w:r>
-    </w:p>
-    <w:p>
-      <w:pPr>
-        <w:spacing w:after="120"/>
-        <w:jc w:val="both"/>
-      </w:pPr>
-      <w:r>
         <w:t xml:space="preserve">Работник може да натрупа стаж и експозиция на вредни фактори в няколко държави. За профилактиката на професионалните заболявания е важно оценките да се предават между държавите, без да се губи смисълът им. На равнище ЕС няма стандарт за набора от данни на такова обобщение, а изискванията се различават по държави. Затова наборът е изведен от общите изисквания в законодателствата на Франция, България и Белгия.</w:t>
       </w:r>
     </w:p>
     <w:p>
       <w:pPr>
-        <w:spacing w:after="120"/>
         <w:jc w:val="left"/>
       </w:pPr>
       <w:r>
@@ -775,7 +689,6 @@
     </w:p>
     <w:p>
       <w:pPr>
-        <w:spacing w:after="120"/>
         <w:jc w:val="left"/>
       </w:pPr>
       <w:r>
@@ -803,8 +716,6 @@
           <w:ilvl w:val="0"/>
           <w:numId w:val="4"/>
         </w:numPr>
-        <w:spacing w:after="100"/>
-        <w:jc w:val="both"/>
       </w:pPr>
       <w:r>
         <w:rPr>
@@ -824,8 +735,6 @@
           <w:ilvl w:val="0"/>
           <w:numId w:val="4"/>
         </w:numPr>
-        <w:spacing w:after="100"/>
-        <w:jc w:val="both"/>
       </w:pPr>
       <w:r>
         <w:rPr>
@@ -840,10 +749,7 @@
     </w:p>
     <w:p>
       <w:pPr>
-        <w:keepNext/>
-        <w:spacing w:after="80" w:before="120"/>
-        <w:ind w:firstLine="0"/>
-        <w:jc w:val="center"/>
+        <w:pStyle w:val="Figure"/>
       </w:pPr>
       <w:r>
         <w:drawing>
@@ -882,9 +788,7 @@
     </w:p>
     <w:p>
       <w:pPr>
-        <w:spacing w:after="240"/>
-        <w:ind w:firstLine="0"/>
-        <w:jc w:val="center"/>
+        <w:pStyle w:val="FigureCaption"/>
       </w:pPr>
       <w:r>
         <w:t>Фиг. 2. Архетипът на обобщението в LinkEHR Studio и резултатът от проверката му</w:t>
@@ -897,8 +801,6 @@
           <w:ilvl w:val="0"/>
           <w:numId w:val="4"/>
         </w:numPr>
-        <w:spacing w:after="100"/>
-        <w:jc w:val="both"/>
       </w:pPr>
       <w:r>
         <w:rPr>
@@ -918,8 +820,6 @@
           <w:ilvl w:val="0"/>
           <w:numId w:val="4"/>
         </w:numPr>
-        <w:spacing w:after="100"/>
-        <w:jc w:val="left"/>
       </w:pPr>
       <w:r>
         <w:rPr>
@@ -939,9 +839,7 @@
       </w:r>
       <w:r>
         <w:rPr>
-          <w:rFonts w:ascii="Consolas" w:cs="Consolas" w:eastAsia="Consolas" w:hAnsi="Consolas"/>
-          <w:sz w:val="21"/>
-          <w:szCs w:val="21"/>
+          <w:rStyle w:val="InlineCode"/>
         </w:rPr>
         <w:t xml:space="preserve">EN13606-RM.xsd</w:t>
       </w:r>
@@ -950,9 +848,7 @@
       </w:r>
       <w:r>
         <w:rPr>
-          <w:rFonts w:ascii="Consolas" w:cs="Consolas" w:eastAsia="Consolas" w:hAnsi="Consolas"/>
-          <w:sz w:val="21"/>
-          <w:szCs w:val="21"/>
+          <w:rStyle w:val="InlineCode"/>
         </w:rPr>
         <w:t xml:space="preserve">TS14796-dataTypes.xsd</w:t>
       </w:r>
@@ -967,8 +863,6 @@
           <w:ilvl w:val="0"/>
           <w:numId w:val="4"/>
         </w:numPr>
-        <w:spacing w:after="100"/>
-        <w:jc w:val="both"/>
       </w:pPr>
       <w:r>
         <w:rPr>
@@ -988,8 +882,6 @@
           <w:ilvl w:val="0"/>
           <w:numId w:val="4"/>
         </w:numPr>
-        <w:spacing w:after="100"/>
-        <w:jc w:val="both"/>
       </w:pPr>
       <w:r>
         <w:rPr>
@@ -1004,10 +896,7 @@
     </w:p>
     <w:p>
       <w:pPr>
-        <w:keepNext/>
-        <w:spacing w:after="80" w:before="120"/>
-        <w:ind w:firstLine="0"/>
-        <w:jc w:val="center"/>
+        <w:pStyle w:val="Figure"/>
       </w:pPr>
       <w:r>
         <w:drawing>
@@ -1046,9 +935,7 @@
     </w:p>
     <w:p>
       <w:pPr>
-        <w:spacing w:after="240"/>
-        <w:ind w:firstLine="0"/>
-        <w:jc w:val="center"/>
+        <w:pStyle w:val="FigureCaption"/>
       </w:pPr>
       <w:r>
         <w:t>Фиг. 3. Концентрацията на химичния агент във въздуха – PQ в μg/m³</w:t>
@@ -1064,7 +951,6 @@
     </w:p>
     <w:p>
       <w:pPr>
-        <w:spacing w:after="120"/>
         <w:jc w:val="both"/>
       </w:pPr>
       <w:r>
@@ -1078,9 +964,7 @@
       </w:r>
       <w:r>
         <w:rPr>
-          <w:rFonts w:ascii="Consolas" w:cs="Consolas" w:eastAsia="Consolas" w:hAnsi="Consolas"/>
-          <w:sz w:val="21"/>
-          <w:szCs w:val="21"/>
+          <w:rStyle w:val="InlineCode"/>
         </w:rPr>
         <w:t xml:space="preserve">rc_id</w:t>
       </w:r>
@@ -1090,10 +974,7 @@
     </w:p>
     <w:p>
       <w:pPr>
-        <w:keepNext/>
-        <w:spacing w:after="80" w:before="120"/>
-        <w:ind w:firstLine="0"/>
-        <w:jc w:val="center"/>
+        <w:pStyle w:val="Figure"/>
       </w:pPr>
       <w:r>
         <w:drawing>
@@ -1132,9 +1013,7 @@
     </w:p>
     <w:p>
       <w:pPr>
-        <w:spacing w:after="240"/>
-        <w:ind w:firstLine="0"/>
-        <w:jc w:val="center"/>
+        <w:pStyle w:val="FigureCaption"/>
       </w:pPr>
       <w:r>
         <w:t>Фиг. 4. Резултатът от проверката на петте инстанции на обобщението</w:t>
@@ -1150,7 +1029,6 @@
     </w:p>
     <w:p>
       <w:pPr>
-        <w:spacing w:after="120"/>
         <w:jc w:val="left"/>
       </w:pPr>
       <w:r>
@@ -1167,7 +1045,6 @@
     </w:p>
     <w:p>
       <w:pPr>
-        <w:spacing w:after="120"/>
         <w:jc w:val="both"/>
       </w:pPr>
       <w:r>
@@ -1176,7 +1053,6 @@
     </w:p>
     <w:p>
       <w:pPr>
-        <w:spacing w:after="120"/>
         <w:jc w:val="both"/>
       </w:pPr>
       <w:r>
@@ -1185,7 +1061,6 @@
     </w:p>
     <w:p>
       <w:pPr>
-        <w:spacing w:after="120"/>
         <w:jc w:val="both"/>
       </w:pPr>
       <w:r>
@@ -1207,8 +1082,6 @@
           <w:ilvl w:val="0"/>
           <w:numId w:val="5"/>
         </w:numPr>
-        <w:spacing w:after="100"/>
-        <w:jc w:val="both"/>
       </w:pPr>
       <w:r>
         <w:rPr>
@@ -1228,8 +1101,6 @@
           <w:ilvl w:val="0"/>
           <w:numId w:val="5"/>
         </w:numPr>
-        <w:spacing w:after="100"/>
-        <w:jc w:val="both"/>
       </w:pPr>
       <w:r>
         <w:rPr>
@@ -1244,10 +1115,7 @@
     </w:p>
     <w:p>
       <w:pPr>
-        <w:keepNext/>
-        <w:spacing w:after="80" w:before="120"/>
-        <w:ind w:firstLine="0"/>
-        <w:jc w:val="center"/>
+        <w:pStyle w:val="Figure"/>
       </w:pPr>
       <w:r>
         <w:drawing>
@@ -1286,9 +1154,7 @@
     </w:p>
     <w:p>
       <w:pPr>
-        <w:spacing w:after="240"/>
-        <w:ind w:firstLine="0"/>
-        <w:jc w:val="center"/>
+        <w:pStyle w:val="FigureCaption"/>
       </w:pPr>
       <w:r>
         <w:t>Фиг. 5. Архетипът на бързото известие в LinkEHR Studio и резултатът от проверката му</w:t>
@@ -1301,8 +1167,6 @@
           <w:ilvl w:val="0"/>
           <w:numId w:val="5"/>
         </w:numPr>
-        <w:spacing w:after="100"/>
-        <w:jc w:val="both"/>
       </w:pPr>
       <w:r>
         <w:rPr>
@@ -1322,8 +1186,6 @@
           <w:ilvl w:val="0"/>
           <w:numId w:val="5"/>
         </w:numPr>
-        <w:spacing w:after="100"/>
-        <w:jc w:val="both"/>
       </w:pPr>
       <w:r>
         <w:rPr>
@@ -1343,8 +1205,6 @@
           <w:ilvl w:val="0"/>
           <w:numId w:val="5"/>
         </w:numPr>
-        <w:spacing w:after="100"/>
-        <w:jc w:val="both"/>
       </w:pPr>
       <w:r>
         <w:rPr>
@@ -1367,7 +1227,6 @@
     </w:p>
     <w:p>
       <w:pPr>
-        <w:spacing w:after="120"/>
         <w:jc w:val="both"/>
       </w:pPr>
       <w:r>
@@ -1376,10 +1235,7 @@
     </w:p>
     <w:p>
       <w:pPr>
-        <w:keepNext/>
-        <w:spacing w:after="80" w:before="120"/>
-        <w:ind w:firstLine="0"/>
-        <w:jc w:val="center"/>
+        <w:pStyle w:val="Figure"/>
       </w:pPr>
       <w:r>
         <w:drawing>
@@ -1418,9 +1274,7 @@
     </w:p>
     <w:p>
       <w:pPr>
-        <w:spacing w:after="240"/>
-        <w:ind w:firstLine="0"/>
-        <w:jc w:val="center"/>
+        <w:pStyle w:val="FigureCaption"/>
       </w:pPr>
       <w:r>
         <w:t>Фиг. 6. Резултатът от проверката на трите инстанции на бързото известие</w:t>
@@ -1428,7 +1282,6 @@
     </w:p>
     <w:p>
       <w:pPr>
-        <w:spacing w:after="120"/>
         <w:jc w:val="both"/>
       </w:pPr>
       <w:r>
@@ -1437,10 +1290,7 @@
     </w:p>
     <w:p>
       <w:pPr>
-        <w:keepNext/>
-        <w:spacing w:after="80" w:before="120"/>
-        <w:ind w:firstLine="0"/>
-        <w:jc w:val="center"/>
+        <w:pStyle w:val="Figure"/>
       </w:pPr>
       <w:r>
         <w:drawing>
@@ -1479,9 +1329,7 @@
     </w:p>
     <w:p>
       <w:pPr>
-        <w:spacing w:after="240"/>
-        <w:ind w:firstLine="0"/>
-        <w:jc w:val="center"/>
+        <w:pStyle w:val="FigureCaption"/>
       </w:pPr>
       <w:r>
         <w:t>Фиг. 7. Резултатът от проверката с двете бази от данни</w:t>
@@ -1502,8 +1350,6 @@
           <w:ilvl w:val="0"/>
           <w:numId w:val="2"/>
         </w:numPr>
-        <w:spacing w:after="80"/>
-        <w:jc w:val="both"/>
       </w:pPr>
       <w:r>
         <w:t xml:space="preserve">Класът на случая се определя от правило в приложната логика, а не следва от семантичното обвързване на критериите.</w:t>
@@ -1516,8 +1362,6 @@
           <w:ilvl w:val="0"/>
           <w:numId w:val="2"/>
         </w:numPr>
-        <w:spacing w:after="80"/>
-        <w:jc w:val="both"/>
       </w:pPr>
       <w:r>
         <w:t xml:space="preserve">Обменът между системите остава по договорената XML схема, а системата само изнася инстанции по архетипа.</w:t>
@@ -1530,8 +1374,6 @@
           <w:ilvl w:val="0"/>
           <w:numId w:val="2"/>
         </w:numPr>
-        <w:spacing w:after="80"/>
-        <w:jc w:val="both"/>
       </w:pPr>
       <w:r>
         <w:t xml:space="preserve">За тази област няма архетип по спецификациите openEHR, нито обвързване със SNOMED CT и LOINC.</w:t>
@@ -1544,8 +1386,6 @@
           <w:ilvl w:val="0"/>
           <w:numId w:val="2"/>
         </w:numPr>
-        <w:spacing w:after="80"/>
-        <w:jc w:val="both"/>
       </w:pPr>
       <w:r>
         <w:t xml:space="preserve">Клиничният критерий на част от заболяванията не е номериран в наредбата, затова номерът на критерия е незадължителен. На две места наредбата повтаря номер: при грип A(H5N1) клиничните критерии носят номерата на лабораторните след тях (17.2.2), а при маларията клиничният критерий носи номера на заглавието си (41.1). Кодът на критерия запазва тези номера, както са в наредбата, а критериите се различават по текста си. Полът се предава с кода, който използва системата, защото наредбата не посочва номенклатура за него, а кодирането му не е описано и в базата.</w:t>
@@ -1558,8 +1398,6 @@
           <w:ilvl w:val="0"/>
           <w:numId w:val="2"/>
         </w:numPr>
-        <w:spacing w:after="80"/>
-        <w:jc w:val="both"/>
       </w:pPr>
       <w:r>
         <w:t xml:space="preserve">Моделът следва текста на наредбата така, както е записан в базата от данни на системата.</w:t>
@@ -1575,21 +1413,16 @@
     </w:p>
     <w:tbl>
       <w:tblPr>
-        <w:tblW w:type="dxa" w:w="9072"/>
-        <w:tblBorders>
-          <w:top w:val="single" w:color="auto" w:sz="4"/>
-          <w:left w:val="single" w:color="auto" w:sz="4"/>
-          <w:bottom w:val="single" w:color="auto" w:sz="4"/>
-          <w:right w:val="single" w:color="auto" w:sz="4"/>
-          <w:insideH w:val="single" w:color="auto" w:sz="4"/>
-          <w:insideV w:val="single" w:color="auto" w:sz="4"/>
-        </w:tblBorders>
+        <w:tblStyle w:val="TableDesign"/>
+        <w:tblW w:w="9072" w:type="dxa"/>
+        <w:tblLayout w:type="fixed"/>
+        <w:tblLook w:val="04A0" w:firstRow="1" w:lastRow="0" w:firstColumn="1" w:lastColumn="0" w:noHBand="0" w:noVBand="1"/>
       </w:tblPr>
       <w:tblGrid>
-        <w:gridCol w:w="1600"/>
-        <w:gridCol w:w="2900"/>
-        <w:gridCol w:w="2000"/>
-        <w:gridCol w:w="2572"/>
+        <w:gridCol w:w="1560"/>
+        <w:gridCol w:w="2665"/>
+        <w:gridCol w:w="2615"/>
+        <w:gridCol w:w="2232"/>
       </w:tblGrid>
       <w:tr>
         <w:trPr>
@@ -1597,116 +1430,52 @@
         </w:trPr>
         <w:tc>
           <w:tcPr>
-            <w:tcW w:type="dxa" w:w="1700"/>
-            <w:tcBorders>
-              <w:top w:val="single" w:color="93ACC0" w:sz="4"/>
-              <w:left w:val="single" w:color="93ACC0" w:sz="4"/>
-              <w:bottom w:val="single" w:color="93ACC0" w:sz="4"/>
-              <w:right w:val="single" w:color="93ACC0" w:sz="4"/>
-            </w:tcBorders>
-            <w:shd w:fill="E7ECF0" w:color="auto" w:val="clear"/>
-            <w:tcMar>
-              <w:top w:type="dxa" w:w="60"/>
-              <w:left w:type="dxa" w:w="100"/>
-              <w:bottom w:type="dxa" w:w="60"/>
-              <w:right w:type="dxa" w:w="100"/>
-            </w:tcMar>
+            <w:tcW w:w="1560" w:type="dxa"/>
           </w:tcPr>
           <w:p>
+            <w:pPr>
+              <w:pStyle w:val="TableText"/>
+            </w:pPr>
             <w:r>
-              <w:rPr>
-                <w:b/>
-                <w:bCs/>
-                <w:sz w:val="21"/>
-                <w:szCs w:val="21"/>
-              </w:rPr>
               <w:t xml:space="preserve"/>
             </w:r>
           </w:p>
         </w:tc>
         <w:tc>
           <w:tcPr>
-            <w:tcW w:type="dxa" w:w="2600"/>
-            <w:tcBorders>
-              <w:top w:val="single" w:color="93ACC0" w:sz="4"/>
-              <w:left w:val="single" w:color="93ACC0" w:sz="4"/>
-              <w:bottom w:val="single" w:color="93ACC0" w:sz="4"/>
-              <w:right w:val="single" w:color="93ACC0" w:sz="4"/>
-            </w:tcBorders>
-            <w:shd w:fill="E7ECF0" w:color="auto" w:val="clear"/>
-            <w:tcMar>
-              <w:top w:type="dxa" w:w="60"/>
-              <w:left w:type="dxa" w:w="100"/>
-              <w:bottom w:type="dxa" w:w="60"/>
-              <w:right w:type="dxa" w:w="100"/>
-            </w:tcMar>
+            <w:tcW w:w="2665" w:type="dxa"/>
           </w:tcPr>
           <w:p>
+            <w:pPr>
+              <w:pStyle w:val="TableText"/>
+            </w:pPr>
             <w:r>
-              <w:rPr>
-                <w:b/>
-                <w:bCs/>
-                <w:sz w:val="21"/>
-                <w:szCs w:val="21"/>
-              </w:rPr>
               <w:t xml:space="preserve">Индекс на телесна маса [П1]</w:t>
             </w:r>
           </w:p>
         </w:tc>
         <w:tc>
           <w:tcPr>
-            <w:tcW w:type="dxa" w:w="2400"/>
-            <w:tcBorders>
-              <w:top w:val="single" w:color="93ACC0" w:sz="4"/>
-              <w:left w:val="single" w:color="93ACC0" w:sz="4"/>
-              <w:bottom w:val="single" w:color="93ACC0" w:sz="4"/>
-              <w:right w:val="single" w:color="93ACC0" w:sz="4"/>
-            </w:tcBorders>
-            <w:shd w:fill="E7ECF0" w:color="auto" w:val="clear"/>
-            <w:tcMar>
-              <w:top w:type="dxa" w:w="60"/>
-              <w:left w:type="dxa" w:w="100"/>
-              <w:bottom w:type="dxa" w:w="60"/>
-              <w:right w:type="dxa" w:w="100"/>
-            </w:tcMar>
+            <w:tcW w:w="2615" w:type="dxa"/>
           </w:tcPr>
           <w:p>
+            <w:pPr>
+              <w:pStyle w:val="TableText"/>
+            </w:pPr>
             <w:r>
-              <w:rPr>
-                <w:b/>
-                <w:bCs/>
-                <w:sz w:val="21"/>
-                <w:szCs w:val="21"/>
-              </w:rPr>
               <w:t xml:space="preserve">Обобщение на оценката на професионалното здраве [П2], [СП1]</w:t>
             </w:r>
           </w:p>
         </w:tc>
         <w:tc>
           <w:tcPr>
-            <w:tcW w:type="dxa" w:w="2372"/>
-            <w:tcBorders>
-              <w:top w:val="single" w:color="93ACC0" w:sz="4"/>
-              <w:left w:val="single" w:color="93ACC0" w:sz="4"/>
-              <w:bottom w:val="single" w:color="93ACC0" w:sz="4"/>
-              <w:right w:val="single" w:color="93ACC0" w:sz="4"/>
-            </w:tcBorders>
-            <w:shd w:fill="E7ECF0" w:color="auto" w:val="clear"/>
-            <w:tcMar>
-              <w:top w:type="dxa" w:w="60"/>
-              <w:left w:type="dxa" w:w="100"/>
-              <w:bottom w:type="dxa" w:w="60"/>
-              <w:right w:type="dxa" w:w="100"/>
-            </w:tcMar>
+            <w:tcW w:w="2232" w:type="dxa"/>
           </w:tcPr>
           <w:p>
+            <w:pPr>
+              <w:pStyle w:val="TableText"/>
+            </w:pPr>
             <w:r>
-              <w:rPr>
-                <w:b/>
-                <w:bCs/>
-                <w:sz w:val="21"/>
-                <w:szCs w:val="21"/>
-              </w:rPr>
               <w:t xml:space="preserve">Бързо известие (продължение на [П3])</w:t>
             </w:r>
           </w:p>
@@ -1718,28 +1487,16 @@
         </w:trPr>
         <w:tc>
           <w:tcPr>
-            <w:tcW w:type="dxa" w:w="1700"/>
-            <w:tcBorders>
-              <w:top w:val="single" w:color="93ACC0" w:sz="4"/>
-              <w:left w:val="single" w:color="93ACC0" w:sz="4"/>
-              <w:bottom w:val="single" w:color="93ACC0" w:sz="4"/>
-              <w:right w:val="single" w:color="93ACC0" w:sz="4"/>
-            </w:tcBorders>
-            <w:shd w:fill="E7ECF0" w:color="auto" w:val="clear"/>
-            <w:tcMar>
-              <w:top w:type="dxa" w:w="60"/>
-              <w:left w:type="dxa" w:w="100"/>
-              <w:bottom w:type="dxa" w:w="60"/>
-              <w:right w:type="dxa" w:w="100"/>
-            </w:tcMar>
+            <w:tcW w:w="1560" w:type="dxa"/>
           </w:tcPr>
           <w:p>
+            <w:pPr>
+              <w:pStyle w:val="TableText"/>
+            </w:pPr>
             <w:r>
               <w:rPr>
                 <w:b/>
                 <w:bCs/>
-                <w:sz w:val="21"/>
-                <w:szCs w:val="21"/>
               </w:rPr>
               <w:t xml:space="preserve">Рамка</w:t>
             </w:r>
@@ -1747,27 +1504,16 @@
         </w:tc>
         <w:tc>
           <w:tcPr>
-            <w:tcW w:type="dxa" w:w="2600"/>
-            <w:tcBorders>
-              <w:top w:val="single" w:color="93ACC0" w:sz="4"/>
-              <w:left w:val="single" w:color="93ACC0" w:sz="4"/>
-              <w:bottom w:val="single" w:color="93ACC0" w:sz="4"/>
-              <w:right w:val="single" w:color="93ACC0" w:sz="4"/>
-            </w:tcBorders>
-            <w:tcMar>
-              <w:top w:type="dxa" w:w="60"/>
-              <w:left w:type="dxa" w:w="100"/>
-              <w:bottom w:type="dxa" w:w="60"/>
-              <w:right w:type="dxa" w:w="100"/>
-            </w:tcMar>
+            <w:tcW w:w="2665" w:type="dxa"/>
           </w:tcPr>
           <w:p>
+            <w:pPr>
+              <w:pStyle w:val="TableText"/>
+            </w:pPr>
             <w:r>
               <w:rPr>
                 <w:b w:val="false"/>
                 <w:bCs w:val="false"/>
-                <w:sz w:val="21"/>
-                <w:szCs w:val="21"/>
               </w:rPr>
               <w:t xml:space="preserve">openEHR</w:t>
             </w:r>
@@ -1775,27 +1521,16 @@
         </w:tc>
         <w:tc>
           <w:tcPr>
-            <w:tcW w:type="dxa" w:w="2400"/>
-            <w:tcBorders>
-              <w:top w:val="single" w:color="93ACC0" w:sz="4"/>
-              <w:left w:val="single" w:color="93ACC0" w:sz="4"/>
-              <w:bottom w:val="single" w:color="93ACC0" w:sz="4"/>
-              <w:right w:val="single" w:color="93ACC0" w:sz="4"/>
-            </w:tcBorders>
-            <w:tcMar>
-              <w:top w:type="dxa" w:w="60"/>
-              <w:left w:type="dxa" w:w="100"/>
-              <w:bottom w:type="dxa" w:w="60"/>
-              <w:right w:type="dxa" w:w="100"/>
-            </w:tcMar>
+            <w:tcW w:w="2615" w:type="dxa"/>
           </w:tcPr>
           <w:p>
+            <w:pPr>
+              <w:pStyle w:val="TableText"/>
+            </w:pPr>
             <w:r>
               <w:rPr>
                 <w:b w:val="false"/>
                 <w:bCs w:val="false"/>
-                <w:sz w:val="21"/>
-                <w:szCs w:val="21"/>
               </w:rPr>
               <w:t xml:space="preserve">EN ISO 13606</w:t>
             </w:r>
@@ -1803,27 +1538,16 @@
         </w:tc>
         <w:tc>
           <w:tcPr>
-            <w:tcW w:type="dxa" w:w="2372"/>
-            <w:tcBorders>
-              <w:top w:val="single" w:color="93ACC0" w:sz="4"/>
-              <w:left w:val="single" w:color="93ACC0" w:sz="4"/>
-              <w:bottom w:val="single" w:color="93ACC0" w:sz="4"/>
-              <w:right w:val="single" w:color="93ACC0" w:sz="4"/>
-            </w:tcBorders>
-            <w:tcMar>
-              <w:top w:type="dxa" w:w="60"/>
-              <w:left w:type="dxa" w:w="100"/>
-              <w:bottom w:type="dxa" w:w="60"/>
-              <w:right w:type="dxa" w:w="100"/>
-            </w:tcMar>
+            <w:tcW w:w="2232" w:type="dxa"/>
           </w:tcPr>
           <w:p>
+            <w:pPr>
+              <w:pStyle w:val="TableText"/>
+            </w:pPr>
             <w:r>
               <w:rPr>
                 <w:b w:val="false"/>
                 <w:bCs w:val="false"/>
-                <w:sz w:val="21"/>
-                <w:szCs w:val="21"/>
               </w:rPr>
               <w:t xml:space="preserve">EN ISO 13606</w:t>
             </w:r>
@@ -1836,28 +1560,16 @@
         </w:trPr>
         <w:tc>
           <w:tcPr>
-            <w:tcW w:type="dxa" w:w="1700"/>
-            <w:tcBorders>
-              <w:top w:val="single" w:color="93ACC0" w:sz="4"/>
-              <w:left w:val="single" w:color="93ACC0" w:sz="4"/>
-              <w:bottom w:val="single" w:color="93ACC0" w:sz="4"/>
-              <w:right w:val="single" w:color="93ACC0" w:sz="4"/>
-            </w:tcBorders>
-            <w:shd w:fill="E7ECF0" w:color="auto" w:val="clear"/>
-            <w:tcMar>
-              <w:top w:type="dxa" w:w="60"/>
-              <w:left w:type="dxa" w:w="100"/>
-              <w:bottom w:type="dxa" w:w="60"/>
-              <w:right w:type="dxa" w:w="100"/>
-            </w:tcMar>
+            <w:tcW w:w="1560" w:type="dxa"/>
           </w:tcPr>
           <w:p>
+            <w:pPr>
+              <w:pStyle w:val="TableText"/>
+            </w:pPr>
             <w:r>
               <w:rPr>
                 <w:b/>
                 <w:bCs/>
-                <w:sz w:val="21"/>
-                <w:szCs w:val="21"/>
               </w:rPr>
               <w:t xml:space="preserve">Модел</w:t>
             </w:r>
@@ -1865,27 +1577,16 @@
         </w:tc>
         <w:tc>
           <w:tcPr>
-            <w:tcW w:type="dxa" w:w="2600"/>
-            <w:tcBorders>
-              <w:top w:val="single" w:color="93ACC0" w:sz="4"/>
-              <w:left w:val="single" w:color="93ACC0" w:sz="4"/>
-              <w:bottom w:val="single" w:color="93ACC0" w:sz="4"/>
-              <w:right w:val="single" w:color="93ACC0" w:sz="4"/>
-            </w:tcBorders>
-            <w:tcMar>
-              <w:top w:type="dxa" w:w="60"/>
-              <w:left w:type="dxa" w:w="100"/>
-              <w:bottom w:type="dxa" w:w="60"/>
-              <w:right w:type="dxa" w:w="100"/>
-            </w:tcMar>
+            <w:tcW w:w="2665" w:type="dxa"/>
           </w:tcPr>
           <w:p>
+            <w:pPr>
+              <w:pStyle w:val="TableText"/>
+            </w:pPr>
             <w:r>
               <w:rPr>
                 <w:b w:val="false"/>
                 <w:bCs w:val="false"/>
-                <w:sz w:val="21"/>
-                <w:szCs w:val="21"/>
               </w:rPr>
               <w:t xml:space="preserve">три архетипа от CKM и композиция, изградена в Archetype Designer</w:t>
             </w:r>
@@ -1893,27 +1594,16 @@
         </w:tc>
         <w:tc>
           <w:tcPr>
-            <w:tcW w:type="dxa" w:w="2400"/>
-            <w:tcBorders>
-              <w:top w:val="single" w:color="93ACC0" w:sz="4"/>
-              <w:left w:val="single" w:color="93ACC0" w:sz="4"/>
-              <w:bottom w:val="single" w:color="93ACC0" w:sz="4"/>
-              <w:right w:val="single" w:color="93ACC0" w:sz="4"/>
-            </w:tcBorders>
-            <w:tcMar>
-              <w:top w:type="dxa" w:w="60"/>
-              <w:left w:type="dxa" w:w="100"/>
-              <w:bottom w:type="dxa" w:w="60"/>
-              <w:right w:type="dxa" w:w="100"/>
-            </w:tcMar>
+            <w:tcW w:w="2615" w:type="dxa"/>
           </w:tcPr>
           <w:p>
+            <w:pPr>
+              <w:pStyle w:val="TableText"/>
+            </w:pPr>
             <w:r>
               <w:rPr>
                 <w:b w:val="false"/>
                 <w:bCs w:val="false"/>
-                <w:sz w:val="21"/>
-                <w:szCs w:val="21"/>
               </w:rPr>
               <w:t xml:space="preserve">архетип, изграден в LinkEHR Studio</w:t>
             </w:r>
@@ -1921,27 +1611,16 @@
         </w:tc>
         <w:tc>
           <w:tcPr>
-            <w:tcW w:type="dxa" w:w="2372"/>
-            <w:tcBorders>
-              <w:top w:val="single" w:color="93ACC0" w:sz="4"/>
-              <w:left w:val="single" w:color="93ACC0" w:sz="4"/>
-              <w:bottom w:val="single" w:color="93ACC0" w:sz="4"/>
-              <w:right w:val="single" w:color="93ACC0" w:sz="4"/>
-            </w:tcBorders>
-            <w:tcMar>
-              <w:top w:type="dxa" w:w="60"/>
-              <w:left w:type="dxa" w:w="100"/>
-              <w:bottom w:type="dxa" w:w="60"/>
-              <w:right w:type="dxa" w:w="100"/>
-            </w:tcMar>
+            <w:tcW w:w="2232" w:type="dxa"/>
           </w:tcPr>
           <w:p>
+            <w:pPr>
+              <w:pStyle w:val="TableText"/>
+            </w:pPr>
             <w:r>
               <w:rPr>
                 <w:b w:val="false"/>
                 <w:bCs w:val="false"/>
-                <w:sz w:val="21"/>
-                <w:szCs w:val="21"/>
               </w:rPr>
               <w:t xml:space="preserve">архетип, написан на ADL и проверен в LinkEHR Studio</w:t>
             </w:r>
@@ -1954,28 +1633,16 @@
         </w:trPr>
         <w:tc>
           <w:tcPr>
-            <w:tcW w:type="dxa" w:w="1700"/>
-            <w:tcBorders>
-              <w:top w:val="single" w:color="93ACC0" w:sz="4"/>
-              <w:left w:val="single" w:color="93ACC0" w:sz="4"/>
-              <w:bottom w:val="single" w:color="93ACC0" w:sz="4"/>
-              <w:right w:val="single" w:color="93ACC0" w:sz="4"/>
-            </w:tcBorders>
-            <w:shd w:fill="E7ECF0" w:color="auto" w:val="clear"/>
-            <w:tcMar>
-              <w:top w:type="dxa" w:w="60"/>
-              <w:left w:type="dxa" w:w="100"/>
-              <w:bottom w:type="dxa" w:w="60"/>
-              <w:right w:type="dxa" w:w="100"/>
-            </w:tcMar>
+            <w:tcW w:w="1560" w:type="dxa"/>
           </w:tcPr>
           <w:p>
+            <w:pPr>
+              <w:pStyle w:val="TableText"/>
+            </w:pPr>
             <w:r>
               <w:rPr>
                 <w:b/>
                 <w:bCs/>
-                <w:sz w:val="21"/>
-                <w:szCs w:val="21"/>
               </w:rPr>
               <w:t xml:space="preserve">Шаблон</w:t>
             </w:r>
@@ -1983,27 +1650,16 @@
         </w:tc>
         <w:tc>
           <w:tcPr>
-            <w:tcW w:type="dxa" w:w="2600"/>
-            <w:tcBorders>
-              <w:top w:val="single" w:color="93ACC0" w:sz="4"/>
-              <w:left w:val="single" w:color="93ACC0" w:sz="4"/>
-              <w:bottom w:val="single" w:color="93ACC0" w:sz="4"/>
-              <w:right w:val="single" w:color="93ACC0" w:sz="4"/>
-            </w:tcBorders>
-            <w:tcMar>
-              <w:top w:type="dxa" w:w="60"/>
-              <w:left w:type="dxa" w:w="100"/>
-              <w:bottom w:type="dxa" w:w="60"/>
-              <w:right w:type="dxa" w:w="100"/>
-            </w:tcMar>
+            <w:tcW w:w="2665" w:type="dxa"/>
           </w:tcPr>
           <w:p>
+            <w:pPr>
+              <w:pStyle w:val="TableText"/>
+            </w:pPr>
             <w:r>
               <w:rPr>
                 <w:b w:val="false"/>
                 <w:bCs w:val="false"/>
-                <w:sz w:val="21"/>
-                <w:szCs w:val="21"/>
               </w:rPr>
               <w:t xml:space="preserve">шаблон и оперативен шаблон</w:t>
             </w:r>
@@ -2011,27 +1667,16 @@
         </w:tc>
         <w:tc>
           <w:tcPr>
-            <w:tcW w:type="dxa" w:w="2400"/>
-            <w:tcBorders>
-              <w:top w:val="single" w:color="93ACC0" w:sz="4"/>
-              <w:left w:val="single" w:color="93ACC0" w:sz="4"/>
-              <w:bottom w:val="single" w:color="93ACC0" w:sz="4"/>
-              <w:right w:val="single" w:color="93ACC0" w:sz="4"/>
-            </w:tcBorders>
-            <w:tcMar>
-              <w:top w:type="dxa" w:w="60"/>
-              <w:left w:type="dxa" w:w="100"/>
-              <w:bottom w:type="dxa" w:w="60"/>
-              <w:right w:type="dxa" w:w="100"/>
-            </w:tcMar>
+            <w:tcW w:w="2615" w:type="dxa"/>
           </w:tcPr>
           <w:p>
+            <w:pPr>
+              <w:pStyle w:val="TableText"/>
+            </w:pPr>
             <w:r>
               <w:rPr>
                 <w:b w:val="false"/>
                 <w:bCs w:val="false"/>
-                <w:sz w:val="21"/>
-                <w:szCs w:val="21"/>
               </w:rPr>
               <w:t xml:space="preserve">няма</w:t>
             </w:r>
@@ -2039,27 +1684,16 @@
         </w:tc>
         <w:tc>
           <w:tcPr>
-            <w:tcW w:type="dxa" w:w="2372"/>
-            <w:tcBorders>
-              <w:top w:val="single" w:color="93ACC0" w:sz="4"/>
-              <w:left w:val="single" w:color="93ACC0" w:sz="4"/>
-              <w:bottom w:val="single" w:color="93ACC0" w:sz="4"/>
-              <w:right w:val="single" w:color="93ACC0" w:sz="4"/>
-            </w:tcBorders>
-            <w:tcMar>
-              <w:top w:type="dxa" w:w="60"/>
-              <w:left w:type="dxa" w:w="100"/>
-              <w:bottom w:type="dxa" w:w="60"/>
-              <w:right w:type="dxa" w:w="100"/>
-            </w:tcMar>
+            <w:tcW w:w="2232" w:type="dxa"/>
           </w:tcPr>
           <w:p>
+            <w:pPr>
+              <w:pStyle w:val="TableText"/>
+            </w:pPr>
             <w:r>
               <w:rPr>
                 <w:b w:val="false"/>
                 <w:bCs w:val="false"/>
-                <w:sz w:val="21"/>
-                <w:szCs w:val="21"/>
               </w:rPr>
               <w:t xml:space="preserve">няма</w:t>
             </w:r>
@@ -2072,28 +1706,16 @@
         </w:trPr>
         <w:tc>
           <w:tcPr>
-            <w:tcW w:type="dxa" w:w="1700"/>
-            <w:tcBorders>
-              <w:top w:val="single" w:color="93ACC0" w:sz="4"/>
-              <w:left w:val="single" w:color="93ACC0" w:sz="4"/>
-              <w:bottom w:val="single" w:color="93ACC0" w:sz="4"/>
-              <w:right w:val="single" w:color="93ACC0" w:sz="4"/>
-            </w:tcBorders>
-            <w:shd w:fill="E7ECF0" w:color="auto" w:val="clear"/>
-            <w:tcMar>
-              <w:top w:type="dxa" w:w="60"/>
-              <w:left w:type="dxa" w:w="100"/>
-              <w:bottom w:type="dxa" w:w="60"/>
-              <w:right w:type="dxa" w:w="100"/>
-            </w:tcMar>
+            <w:tcW w:w="1560" w:type="dxa"/>
           </w:tcPr>
           <w:p>
+            <w:pPr>
+              <w:pStyle w:val="TableText"/>
+            </w:pPr>
             <w:r>
               <w:rPr>
                 <w:b/>
                 <w:bCs/>
-                <w:sz w:val="21"/>
-                <w:szCs w:val="21"/>
               </w:rPr>
               <w:t xml:space="preserve">Инстанция</w:t>
             </w:r>
@@ -2101,27 +1723,16 @@
         </w:tc>
         <w:tc>
           <w:tcPr>
-            <w:tcW w:type="dxa" w:w="2600"/>
-            <w:tcBorders>
-              <w:top w:val="single" w:color="93ACC0" w:sz="4"/>
-              <w:left w:val="single" w:color="93ACC0" w:sz="4"/>
-              <w:bottom w:val="single" w:color="93ACC0" w:sz="4"/>
-              <w:right w:val="single" w:color="93ACC0" w:sz="4"/>
-            </w:tcBorders>
-            <w:tcMar>
-              <w:top w:type="dxa" w:w="60"/>
-              <w:left w:type="dxa" w:w="100"/>
-              <w:bottom w:type="dxa" w:w="60"/>
-              <w:right w:type="dxa" w:w="100"/>
-            </w:tcMar>
+            <w:tcW w:w="2665" w:type="dxa"/>
           </w:tcPr>
           <w:p>
+            <w:pPr>
+              <w:pStyle w:val="TableText"/>
+            </w:pPr>
             <w:r>
               <w:rPr>
                 <w:b w:val="false"/>
                 <w:bCs w:val="false"/>
-                <w:sz w:val="21"/>
-                <w:szCs w:val="21"/>
               </w:rPr>
               <w:t xml:space="preserve">изведена от оперативния шаблон с openEHR-OPT и попълнена с примерни стойности</w:t>
             </w:r>
@@ -2129,27 +1740,16 @@
         </w:tc>
         <w:tc>
           <w:tcPr>
-            <w:tcW w:type="dxa" w:w="2400"/>
-            <w:tcBorders>
-              <w:top w:val="single" w:color="93ACC0" w:sz="4"/>
-              <w:left w:val="single" w:color="93ACC0" w:sz="4"/>
-              <w:bottom w:val="single" w:color="93ACC0" w:sz="4"/>
-              <w:right w:val="single" w:color="93ACC0" w:sz="4"/>
-            </w:tcBorders>
-            <w:tcMar>
-              <w:top w:type="dxa" w:w="60"/>
-              <w:left w:type="dxa" w:w="100"/>
-              <w:bottom w:type="dxa" w:w="60"/>
-              <w:right w:type="dxa" w:w="100"/>
-            </w:tcMar>
+            <w:tcW w:w="2615" w:type="dxa"/>
           </w:tcPr>
           <w:p>
+            <w:pPr>
+              <w:pStyle w:val="TableText"/>
+            </w:pPr>
             <w:r>
               <w:rPr>
                 <w:b w:val="false"/>
                 <w:bCs w:val="false"/>
-                <w:sz w:val="21"/>
-                <w:szCs w:val="21"/>
               </w:rPr>
               <w:t xml:space="preserve">изградена спрямо схемата на референтния модел, след това служи за образец</w:t>
             </w:r>
@@ -2157,27 +1757,16 @@
         </w:tc>
         <w:tc>
           <w:tcPr>
-            <w:tcW w:type="dxa" w:w="2372"/>
-            <w:tcBorders>
-              <w:top w:val="single" w:color="93ACC0" w:sz="4"/>
-              <w:left w:val="single" w:color="93ACC0" w:sz="4"/>
-              <w:bottom w:val="single" w:color="93ACC0" w:sz="4"/>
-              <w:right w:val="single" w:color="93ACC0" w:sz="4"/>
-            </w:tcBorders>
-            <w:tcMar>
-              <w:top w:type="dxa" w:w="60"/>
-              <w:left w:type="dxa" w:w="100"/>
-              <w:bottom w:type="dxa" w:w="60"/>
-              <w:right w:type="dxa" w:w="100"/>
-            </w:tcMar>
+            <w:tcW w:w="2232" w:type="dxa"/>
           </w:tcPr>
           <w:p>
+            <w:pPr>
+              <w:pStyle w:val="TableText"/>
+            </w:pPr>
             <w:r>
               <w:rPr>
                 <w:b w:val="false"/>
                 <w:bCs w:val="false"/>
-                <w:sz w:val="21"/>
-                <w:szCs w:val="21"/>
               </w:rPr>
               <w:t xml:space="preserve">изнесена от системата за регистрация</w:t>
             </w:r>
@@ -2190,28 +1779,16 @@
         </w:trPr>
         <w:tc>
           <w:tcPr>
-            <w:tcW w:type="dxa" w:w="1700"/>
-            <w:tcBorders>
-              <w:top w:val="single" w:color="93ACC0" w:sz="4"/>
-              <w:left w:val="single" w:color="93ACC0" w:sz="4"/>
-              <w:bottom w:val="single" w:color="93ACC0" w:sz="4"/>
-              <w:right w:val="single" w:color="93ACC0" w:sz="4"/>
-            </w:tcBorders>
-            <w:shd w:fill="E7ECF0" w:color="auto" w:val="clear"/>
-            <w:tcMar>
-              <w:top w:type="dxa" w:w="60"/>
-              <w:left w:type="dxa" w:w="100"/>
-              <w:bottom w:type="dxa" w:w="60"/>
-              <w:right w:type="dxa" w:w="100"/>
-            </w:tcMar>
+            <w:tcW w:w="1560" w:type="dxa"/>
           </w:tcPr>
           <w:p>
+            <w:pPr>
+              <w:pStyle w:val="TableText"/>
+            </w:pPr>
             <w:r>
               <w:rPr>
                 <w:b/>
                 <w:bCs/>
-                <w:sz w:val="21"/>
-                <w:szCs w:val="21"/>
               </w:rPr>
               <w:t xml:space="preserve">Стъпка 1 (структурна)</w:t>
             </w:r>
@@ -2219,27 +1796,16 @@
         </w:tc>
         <w:tc>
           <w:tcPr>
-            <w:tcW w:type="dxa" w:w="2600"/>
-            <w:tcBorders>
-              <w:top w:val="single" w:color="93ACC0" w:sz="4"/>
-              <w:left w:val="single" w:color="93ACC0" w:sz="4"/>
-              <w:bottom w:val="single" w:color="93ACC0" w:sz="4"/>
-              <w:right w:val="single" w:color="93ACC0" w:sz="4"/>
-            </w:tcBorders>
-            <w:tcMar>
-              <w:top w:type="dxa" w:w="60"/>
-              <w:left w:type="dxa" w:w="100"/>
-              <w:bottom w:type="dxa" w:w="60"/>
-              <w:right w:type="dxa" w:w="100"/>
-            </w:tcMar>
+            <w:tcW w:w="2665" w:type="dxa"/>
           </w:tcPr>
           <w:p>
+            <w:pPr>
+              <w:pStyle w:val="TableText"/>
+            </w:pPr>
             <w:r>
               <w:rPr>
                 <w:b w:val="false"/>
                 <w:bCs w:val="false"/>
-                <w:sz w:val="21"/>
-                <w:szCs w:val="21"/>
               </w:rPr>
               <w:t xml:space="preserve">XML схемата на оперативния шаблон</w:t>
             </w:r>
@@ -2247,27 +1813,16 @@
         </w:tc>
         <w:tc>
           <w:tcPr>
-            <w:tcW w:type="dxa" w:w="2400"/>
-            <w:tcBorders>
-              <w:top w:val="single" w:color="93ACC0" w:sz="4"/>
-              <w:left w:val="single" w:color="93ACC0" w:sz="4"/>
-              <w:bottom w:val="single" w:color="93ACC0" w:sz="4"/>
-              <w:right w:val="single" w:color="93ACC0" w:sz="4"/>
-            </w:tcBorders>
-            <w:tcMar>
-              <w:top w:type="dxa" w:w="60"/>
-              <w:left w:type="dxa" w:w="100"/>
-              <w:bottom w:type="dxa" w:w="60"/>
-              <w:right w:type="dxa" w:w="100"/>
-            </w:tcMar>
+            <w:tcW w:w="2615" w:type="dxa"/>
           </w:tcPr>
           <w:p>
+            <w:pPr>
+              <w:pStyle w:val="TableText"/>
+            </w:pPr>
             <w:r>
               <w:rPr>
                 <w:b w:val="false"/>
                 <w:bCs w:val="false"/>
-                <w:sz w:val="21"/>
-                <w:szCs w:val="21"/>
               </w:rPr>
               <w:t xml:space="preserve">EN13606-RM.xsd и TS14796-dataTypes.xsd</w:t>
             </w:r>
@@ -2275,27 +1830,16 @@
         </w:tc>
         <w:tc>
           <w:tcPr>
-            <w:tcW w:type="dxa" w:w="2372"/>
-            <w:tcBorders>
-              <w:top w:val="single" w:color="93ACC0" w:sz="4"/>
-              <w:left w:val="single" w:color="93ACC0" w:sz="4"/>
-              <w:bottom w:val="single" w:color="93ACC0" w:sz="4"/>
-              <w:right w:val="single" w:color="93ACC0" w:sz="4"/>
-            </w:tcBorders>
-            <w:tcMar>
-              <w:top w:type="dxa" w:w="60"/>
-              <w:left w:type="dxa" w:w="100"/>
-              <w:bottom w:type="dxa" w:w="60"/>
-              <w:right w:type="dxa" w:w="100"/>
-            </w:tcMar>
+            <w:tcW w:w="2232" w:type="dxa"/>
           </w:tcPr>
           <w:p>
+            <w:pPr>
+              <w:pStyle w:val="TableText"/>
+            </w:pPr>
             <w:r>
               <w:rPr>
                 <w:b w:val="false"/>
                 <w:bCs w:val="false"/>
-                <w:sz w:val="21"/>
-                <w:szCs w:val="21"/>
               </w:rPr>
               <w:t xml:space="preserve">схемата, изведена от архетипа, за двете нива наведнъж</w:t>
             </w:r>
@@ -2308,28 +1852,16 @@
         </w:trPr>
         <w:tc>
           <w:tcPr>
-            <w:tcW w:type="dxa" w:w="1700"/>
-            <w:tcBorders>
-              <w:top w:val="single" w:color="93ACC0" w:sz="4"/>
-              <w:left w:val="single" w:color="93ACC0" w:sz="4"/>
-              <w:bottom w:val="single" w:color="93ACC0" w:sz="4"/>
-              <w:right w:val="single" w:color="93ACC0" w:sz="4"/>
-            </w:tcBorders>
-            <w:shd w:fill="E7ECF0" w:color="auto" w:val="clear"/>
-            <w:tcMar>
-              <w:top w:type="dxa" w:w="60"/>
-              <w:left w:type="dxa" w:w="100"/>
-              <w:bottom w:type="dxa" w:w="60"/>
-              <w:right w:type="dxa" w:w="100"/>
-            </w:tcMar>
+            <w:tcW w:w="1560" w:type="dxa"/>
           </w:tcPr>
           <w:p>
+            <w:pPr>
+              <w:pStyle w:val="TableText"/>
+            </w:pPr>
             <w:r>
               <w:rPr>
                 <w:b/>
                 <w:bCs/>
-                <w:sz w:val="21"/>
-                <w:szCs w:val="21"/>
               </w:rPr>
               <w:t xml:space="preserve">Стъпка 2 (семантична)</w:t>
             </w:r>
@@ -2337,27 +1869,16 @@
         </w:tc>
         <w:tc>
           <w:tcPr>
-            <w:tcW w:type="dxa" w:w="2600"/>
-            <w:tcBorders>
-              <w:top w:val="single" w:color="93ACC0" w:sz="4"/>
-              <w:left w:val="single" w:color="93ACC0" w:sz="4"/>
-              <w:bottom w:val="single" w:color="93ACC0" w:sz="4"/>
-              <w:right w:val="single" w:color="93ACC0" w:sz="4"/>
-            </w:tcBorders>
-            <w:tcMar>
-              <w:top w:type="dxa" w:w="60"/>
-              <w:left w:type="dxa" w:w="100"/>
-              <w:bottom w:type="dxa" w:w="60"/>
-              <w:right w:type="dxa" w:w="100"/>
-            </w:tcMar>
+            <w:tcW w:w="2665" w:type="dxa"/>
           </w:tcPr>
           <w:p>
+            <w:pPr>
+              <w:pStyle w:val="TableText"/>
+            </w:pPr>
             <w:r>
               <w:rPr>
                 <w:b w:val="false"/>
                 <w:bCs w:val="false"/>
-                <w:sz w:val="21"/>
-                <w:szCs w:val="21"/>
               </w:rPr>
               <w:t xml:space="preserve">ограниченията в оперативния шаблон</w:t>
             </w:r>
@@ -2365,27 +1886,16 @@
         </w:tc>
         <w:tc>
           <w:tcPr>
-            <w:tcW w:type="dxa" w:w="2400"/>
-            <w:tcBorders>
-              <w:top w:val="single" w:color="93ACC0" w:sz="4"/>
-              <w:left w:val="single" w:color="93ACC0" w:sz="4"/>
-              <w:bottom w:val="single" w:color="93ACC0" w:sz="4"/>
-              <w:right w:val="single" w:color="93ACC0" w:sz="4"/>
-            </w:tcBorders>
-            <w:tcMar>
-              <w:top w:type="dxa" w:w="60"/>
-              <w:left w:type="dxa" w:w="100"/>
-              <w:bottom w:type="dxa" w:w="60"/>
-              <w:right w:type="dxa" w:w="100"/>
-            </w:tcMar>
+            <w:tcW w:w="2615" w:type="dxa"/>
           </w:tcPr>
           <w:p>
+            <w:pPr>
+              <w:pStyle w:val="TableText"/>
+            </w:pPr>
             <w:r>
               <w:rPr>
                 <w:b w:val="false"/>
                 <w:bCs w:val="false"/>
-                <w:sz w:val="21"/>
-                <w:szCs w:val="21"/>
               </w:rPr>
               <w:t>ограниченията в архетипа</w:t>
             </w:r>
@@ -2393,27 +1903,16 @@
         </w:tc>
         <w:tc>
           <w:tcPr>
-            <w:tcW w:type="dxa" w:w="2372"/>
-            <w:tcBorders>
-              <w:top w:val="single" w:color="93ACC0" w:sz="4"/>
-              <w:left w:val="single" w:color="93ACC0" w:sz="4"/>
-              <w:bottom w:val="single" w:color="93ACC0" w:sz="4"/>
-              <w:right w:val="single" w:color="93ACC0" w:sz="4"/>
-            </w:tcBorders>
-            <w:tcMar>
-              <w:top w:type="dxa" w:w="60"/>
-              <w:left w:type="dxa" w:w="100"/>
-              <w:bottom w:type="dxa" w:w="60"/>
-              <w:right w:type="dxa" w:w="100"/>
-            </w:tcMar>
+            <w:tcW w:w="2232" w:type="dxa"/>
           </w:tcPr>
           <w:p>
+            <w:pPr>
+              <w:pStyle w:val="TableText"/>
+            </w:pPr>
             <w:r>
               <w:rPr>
                 <w:b w:val="false"/>
                 <w:bCs w:val="false"/>
-                <w:sz w:val="21"/>
-                <w:szCs w:val="21"/>
               </w:rPr>
               <w:t xml:space="preserve">включена в стъпка 1</w:t>
             </w:r>
@@ -2426,28 +1925,16 @@
         </w:trPr>
         <w:tc>
           <w:tcPr>
-            <w:tcW w:type="dxa" w:w="1700"/>
-            <w:tcBorders>
-              <w:top w:val="single" w:color="93ACC0" w:sz="4"/>
-              <w:left w:val="single" w:color="93ACC0" w:sz="4"/>
-              <w:bottom w:val="single" w:color="93ACC0" w:sz="4"/>
-              <w:right w:val="single" w:color="93ACC0" w:sz="4"/>
-            </w:tcBorders>
-            <w:shd w:fill="E7ECF0" w:color="auto" w:val="clear"/>
-            <w:tcMar>
-              <w:top w:type="dxa" w:w="60"/>
-              <w:left w:type="dxa" w:w="100"/>
-              <w:bottom w:type="dxa" w:w="60"/>
-              <w:right w:type="dxa" w:w="100"/>
-            </w:tcMar>
+            <w:tcW w:w="1560" w:type="dxa"/>
           </w:tcPr>
           <w:p>
+            <w:pPr>
+              <w:pStyle w:val="TableText"/>
+            </w:pPr>
             <w:r>
               <w:rPr>
                 <w:b/>
                 <w:bCs/>
-                <w:sz w:val="21"/>
-                <w:szCs w:val="21"/>
               </w:rPr>
               <w:t xml:space="preserve">Невалидни копия</w:t>
             </w:r>
@@ -2455,27 +1942,16 @@
         </w:tc>
         <w:tc>
           <w:tcPr>
-            <w:tcW w:type="dxa" w:w="2600"/>
-            <w:tcBorders>
-              <w:top w:val="single" w:color="93ACC0" w:sz="4"/>
-              <w:left w:val="single" w:color="93ACC0" w:sz="4"/>
-              <w:bottom w:val="single" w:color="93ACC0" w:sz="4"/>
-              <w:right w:val="single" w:color="93ACC0" w:sz="4"/>
-            </w:tcBorders>
-            <w:tcMar>
-              <w:top w:type="dxa" w:w="60"/>
-              <w:left w:type="dxa" w:w="100"/>
-              <w:bottom w:type="dxa" w:w="60"/>
-              <w:right w:type="dxa" w:w="100"/>
-            </w:tcMar>
+            <w:tcW w:w="2665" w:type="dxa"/>
           </w:tcPr>
           <w:p>
+            <w:pPr>
+              <w:pStyle w:val="TableText"/>
+            </w:pPr>
             <w:r>
               <w:rPr>
                 <w:b w:val="false"/>
                 <w:bCs w:val="false"/>
-                <w:sz w:val="21"/>
-                <w:szCs w:val="21"/>
               </w:rPr>
               <w:t xml:space="preserve">без лицето, за което е записът; ръст 1780 cm</w:t>
             </w:r>
@@ -2483,27 +1959,16 @@
         </w:tc>
         <w:tc>
           <w:tcPr>
-            <w:tcW w:type="dxa" w:w="2400"/>
-            <w:tcBorders>
-              <w:top w:val="single" w:color="93ACC0" w:sz="4"/>
-              <w:left w:val="single" w:color="93ACC0" w:sz="4"/>
-              <w:bottom w:val="single" w:color="93ACC0" w:sz="4"/>
-              <w:right w:val="single" w:color="93ACC0" w:sz="4"/>
-            </w:tcBorders>
-            <w:tcMar>
-              <w:top w:type="dxa" w:w="60"/>
-              <w:left w:type="dxa" w:w="100"/>
-              <w:bottom w:type="dxa" w:w="60"/>
-              <w:right w:type="dxa" w:w="100"/>
-            </w:tcMar>
+            <w:tcW w:w="2615" w:type="dxa"/>
           </w:tcPr>
           <w:p>
+            <w:pPr>
+              <w:pStyle w:val="TableText"/>
+            </w:pPr>
             <w:r>
               <w:rPr>
                 <w:b w:val="false"/>
                 <w:bCs w:val="false"/>
-                <w:sz w:val="21"/>
-                <w:szCs w:val="21"/>
               </w:rPr>
               <w:t xml:space="preserve">без rc_id; ЕГН от девет цифри</w:t>
             </w:r>
@@ -2511,27 +1976,16 @@
         </w:tc>
         <w:tc>
           <w:tcPr>
-            <w:tcW w:type="dxa" w:w="2372"/>
-            <w:tcBorders>
-              <w:top w:val="single" w:color="93ACC0" w:sz="4"/>
-              <w:left w:val="single" w:color="93ACC0" w:sz="4"/>
-              <w:bottom w:val="single" w:color="93ACC0" w:sz="4"/>
-              <w:right w:val="single" w:color="93ACC0" w:sz="4"/>
-            </w:tcBorders>
-            <w:tcMar>
-              <w:top w:type="dxa" w:w="60"/>
-              <w:left w:type="dxa" w:w="100"/>
-              <w:bottom w:type="dxa" w:w="60"/>
-              <w:right w:type="dxa" w:w="100"/>
-            </w:tcMar>
+            <w:tcW w:w="2232" w:type="dxa"/>
           </w:tcPr>
           <w:p>
+            <w:pPr>
+              <w:pStyle w:val="TableText"/>
+            </w:pPr>
             <w:r>
               <w:rPr>
                 <w:b w:val="false"/>
                 <w:bCs w:val="false"/>
-                <w:sz w:val="21"/>
-                <w:szCs w:val="21"/>
               </w:rPr>
               <w:t xml:space="preserve">дата в друг формат; клас по друга кодова схема</w:t>
             </w:r>
@@ -2541,11 +1995,6 @@
     </w:tbl>
     <w:p>
       <w:pPr>
-        <w:spacing w:after="120"/>
-      </w:pPr>
-    </w:p>
-    <w:p>
-      <w:pPr>
         <w:pStyle w:val="Heading1"/>
       </w:pPr>
       <w:r>
@@ -2559,8 +2008,6 @@
           <w:ilvl w:val="0"/>
           <w:numId w:val="6"/>
         </w:numPr>
-        <w:spacing w:after="100"/>
-        <w:jc w:val="left"/>
       </w:pPr>
       <w:r>
         <w:t xml:space="preserve">Хранилището се изтегля от </w:t>
@@ -2584,8 +2031,6 @@
           <w:ilvl w:val="0"/>
           <w:numId w:val="6"/>
         </w:numPr>
-        <w:spacing w:after="100"/>
-        <w:jc w:val="both"/>
       </w:pPr>
       <w:r>
         <w:t xml:space="preserve">Описаните модели са в папките body-mass-index, occupational-health-assessment-summary и infectious-disease-case-notification. Папката ambulatory-list съдържа архетипа на амбулаторния лист, който не е описан тук. Във всяка папка има четири подпапки – 1-reference-model, 2-archetypes, 3-instances и 4-validity-check, а в infectious-disease-case-notification има и пета – 5-database-check.</w:t>
@@ -2598,8 +2043,6 @@
           <w:ilvl w:val="0"/>
           <w:numId w:val="6"/>
         </w:numPr>
-        <w:spacing w:after="100"/>
-        <w:jc w:val="left"/>
       </w:pPr>
       <w:r>
         <w:t xml:space="preserve">Под Windows проверката се пуска с validate-all.cmd в папката 4-validity-check. Файлът пуска скрипта validate.ps1 с Windows PowerShell – средата за скриптове, вградена в Windows. Скриптът изпълнява стъпка 1 за всички инстанции и стъпка 2 за онези, които са минали първата. При бързото известие и при амбулаторния лист двете стъпки са една проверка. Скриптът чете схемите, архетипа или оперативния шаблон и инстанциите от съседните подпапки и не променя нищо.</w:t>
@@ -2612,8 +2055,6 @@
           <w:ilvl w:val="0"/>
           <w:numId w:val="6"/>
         </w:numPr>
-        <w:spacing w:after="100"/>
-        <w:jc w:val="both"/>
       </w:pPr>
       <w:r>
         <w:t xml:space="preserve">Прозорецът показва за всяка инстанция резултата от всяка стъпка и дали той съвпада с очаквания. Когато името на файла посочва очаквания резултат (instance-valid, instance-invalid-structural-rm или instance-invalid-semantic-archetype), скриптът го сравнява с действителния. Накрая се извежда обобщение, например „3 instances: 1 valid in both steps, 2 invalid.“ и „All results are as expected from the file names.“ Такива прозорци са показани на Фиг. 1, 4 и 6.</w:t>
@@ -2626,8 +2067,6 @@
           <w:ilvl w:val="0"/>
           <w:numId w:val="6"/>
         </w:numPr>
-        <w:spacing w:after="100"/>
-        <w:jc w:val="left"/>
       </w:pPr>
       <w:r>
         <w:t xml:space="preserve">При индекса на телесна маса и при обобщението стъпките могат да се пуснат и поотделно с validate-1-structural-rm.cmd и validate-2-semantic-archetype.cmd.</w:t>
@@ -2640,8 +2079,6 @@
           <w:ilvl w:val="0"/>
           <w:numId w:val="6"/>
         </w:numPr>
-        <w:spacing w:after="100"/>
-        <w:jc w:val="left"/>
       </w:pPr>
       <w:r>
         <w:t xml:space="preserve">Проверката с двете бази от данни се пуска отделно – с run-check.cmd в папката infectious-disease-case-notification\5-database-check, когато са пуснати MariaDB или MySQL и eXist‑db. Изискванията и настройките са в README.md в същата папка.</w:t>
@@ -2657,7 +2094,6 @@
     </w:p>
     <w:p>
       <w:pPr>
-        <w:spacing w:after="80"/>
         <w:ind w:left="680" w:hanging="680"/>
         <w:jc w:val="both"/>
       </w:pPr>
@@ -2681,7 +2117,6 @@
     </w:p>
     <w:p>
       <w:pPr>
-        <w:spacing w:after="80"/>
         <w:ind w:left="680" w:hanging="680"/>
         <w:jc w:val="both"/>
       </w:pPr>
@@ -2705,7 +2140,6 @@
     </w:p>
     <w:p>
       <w:pPr>
-        <w:spacing w:after="80"/>
         <w:ind w:left="680" w:hanging="680"/>
         <w:jc w:val="both"/>
       </w:pPr>
@@ -2729,7 +2163,6 @@
     </w:p>
     <w:p>
       <w:pPr>
-        <w:spacing w:after="80"/>
         <w:ind w:left="680" w:hanging="680"/>
         <w:jc w:val="both"/>
       </w:pPr>
@@ -2758,8 +2191,6 @@
           <w:ilvl w:val="0"/>
           <w:numId w:val="2"/>
         </w:numPr>
-        <w:spacing w:after="80"/>
-        <w:jc w:val="left"/>
       </w:pPr>
       <w:hyperlink r:id="rId21" w:history="1">
         <w:r>
@@ -2780,8 +2211,6 @@
           <w:ilvl w:val="0"/>
           <w:numId w:val="2"/>
         </w:numPr>
-        <w:spacing w:after="80"/>
-        <w:jc w:val="left"/>
       </w:pPr>
       <w:hyperlink r:id="rId22" w:history="1">
         <w:r>
@@ -2802,8 +2231,6 @@
           <w:ilvl w:val="0"/>
           <w:numId w:val="2"/>
         </w:numPr>
-        <w:spacing w:after="80"/>
-        <w:jc w:val="left"/>
       </w:pPr>
       <w:r>
         <w:t xml:space="preserve">github.com/openEHR/CKM-mirror – копието на Clinical Knowledge Manager в GitHub, от което са взети трите наблюдения.</w:t>
@@ -2816,8 +2243,6 @@
           <w:ilvl w:val="0"/>
           <w:numId w:val="2"/>
         </w:numPr>
-        <w:spacing w:after="80"/>
-        <w:jc w:val="left"/>
       </w:pPr>
       <w:r>
         <w:t xml:space="preserve">github.com/ppazos/openEHR-OPT – библиотеката на CaboLabs за работа с оперативни шаблони.</w:t>
@@ -2826,7 +2251,7 @@
     <w:sectPr>
       <w:footerReference w:type="default" r:id="rId7"/>
       <w:pgSz w:w="11906" w:h="16838" w:orient="portrait"/>
-      <w:pgMar w:top="1417" w:right="1417" w:bottom="1417" w:left="1417" w:header="708" w:footer="708" w:gutter="0"/>
+      <w:pgMar w:top="1417" w:right="1134" w:bottom="1417" w:left="1701" w:header="708" w:footer="708" w:gutter="0"/>
       <w:pgNumType/>
       <w:docGrid w:linePitch="360"/>
     </w:sectPr>
@@ -3114,103 +2539,884 @@
 </file>
 
 <file path=word/styles.xml><?xml version="1.0" encoding="utf-8"?>
-<w:styles xmlns:mc="http://schemas.openxmlformats.org/markup-compatibility/2006" xmlns:r="http://schemas.openxmlformats.org/officeDocument/2006/relationships" xmlns:w="http://schemas.openxmlformats.org/wordprocessingml/2006/main" xmlns:w14="http://schemas.microsoft.com/office/word/2010/wordml" xmlns:w15="http://schemas.microsoft.com/office/word/2012/wordml" mc:Ignorable="w14 w15">
+<w:styles xmlns:mc="http://schemas.openxmlformats.org/markup-compatibility/2006" xmlns:r="http://schemas.openxmlformats.org/officeDocument/2006/relationships" xmlns:w="http://schemas.openxmlformats.org/wordprocessingml/2006/main" xmlns:w14="http://schemas.microsoft.com/office/word/2010/wordml" xmlns:w15="http://schemas.microsoft.com/office/word/2012/wordml" xmlns:w16cex="http://schemas.microsoft.com/office/word/2018/wordml/cex" xmlns:w16cid="http://schemas.microsoft.com/office/word/2016/wordml/cid" xmlns:w16="http://schemas.microsoft.com/office/word/2018/wordml" xmlns:w16du="http://schemas.microsoft.com/office/word/2023/wordml/word16du" xmlns:w16sdtdh="http://schemas.microsoft.com/office/word/2020/wordml/sdtdatahash" xmlns:w16sdtfl="http://schemas.microsoft.com/office/word/2024/wordml/sdtformatlock" xmlns:w16se="http://schemas.microsoft.com/office/word/2015/wordml/symex" mc:Ignorable="w14 w15 w16se w16cid w16 w16cex w16sdtdh w16sdtfl w16du">
   <w:docDefaults>
     <w:rPrDefault>
       <w:rPr>
-        <w:rFonts w:ascii="Times New Roman" w:cs="Times New Roman" w:eastAsia="Times New Roman" w:hAnsi="Times New Roman"/>
+        <w:rFonts w:ascii="Times New Roman" w:eastAsia="Times New Roman" w:hAnsi="Times New Roman" w:cs="Times New Roman"/>
+        <w:kern w:val="2"/>
         <w:sz w:val="24"/>
         <w:szCs w:val="24"/>
+        <w:lang w:val="bg-BG" w:eastAsia="en-US" w:bidi="ar-SA"/>
+        <w14:ligatures w14:val="standardContextual"/>
       </w:rPr>
     </w:rPrDefault>
-    <w:pPrDefault/>
+    <w:pPrDefault>
+      <w:pPr>
+        <w:spacing w:after="160" w:line="278" w:lineRule="auto"/>
+      </w:pPr>
+    </w:pPrDefault>
   </w:docDefaults>
+  <w:latentStyles w:defLockedState="0" w:defUIPriority="99" w:defSemiHidden="0" w:defUnhideWhenUsed="0" w:defQFormat="0" w:count="376">
+    <w:lsdException w:name="Normal" w:uiPriority="0" w:qFormat="1"/>
+    <w:lsdException w:name="heading 1" w:uiPriority="9" w:qFormat="1"/>
+    <w:lsdException w:name="heading 2" w:semiHidden="1" w:uiPriority="9" w:unhideWhenUsed="1" w:qFormat="1"/>
+    <w:lsdException w:name="heading 3" w:semiHidden="1" w:uiPriority="9" w:unhideWhenUsed="1" w:qFormat="1"/>
+    <w:lsdException w:name="heading 4" w:semiHidden="1" w:uiPriority="9" w:unhideWhenUsed="1" w:qFormat="1"/>
+    <w:lsdException w:name="heading 5" w:semiHidden="1" w:uiPriority="9" w:unhideWhenUsed="1" w:qFormat="1"/>
+    <w:lsdException w:name="heading 6" w:semiHidden="1" w:uiPriority="9" w:unhideWhenUsed="1" w:qFormat="1"/>
+    <w:lsdException w:name="heading 7" w:semiHidden="1" w:uiPriority="9" w:unhideWhenUsed="1" w:qFormat="1"/>
+    <w:lsdException w:name="heading 8" w:semiHidden="1" w:uiPriority="9" w:unhideWhenUsed="1" w:qFormat="1"/>
+    <w:lsdException w:name="heading 9" w:semiHidden="1" w:uiPriority="9" w:unhideWhenUsed="1" w:qFormat="1"/>
+    <w:lsdException w:name="index 1" w:semiHidden="1" w:unhideWhenUsed="1"/>
+    <w:lsdException w:name="index 2" w:semiHidden="1" w:unhideWhenUsed="1"/>
+    <w:lsdException w:name="index 3" w:semiHidden="1" w:unhideWhenUsed="1"/>
+    <w:lsdException w:name="index 4" w:semiHidden="1" w:unhideWhenUsed="1"/>
+    <w:lsdException w:name="index 5" w:semiHidden="1" w:unhideWhenUsed="1"/>
+    <w:lsdException w:name="index 6" w:semiHidden="1" w:unhideWhenUsed="1"/>
+    <w:lsdException w:name="index 7" w:semiHidden="1" w:unhideWhenUsed="1"/>
+    <w:lsdException w:name="index 8" w:semiHidden="1" w:unhideWhenUsed="1"/>
+    <w:lsdException w:name="index 9" w:semiHidden="1" w:unhideWhenUsed="1"/>
+    <w:lsdException w:name="toc 1" w:semiHidden="1" w:uiPriority="39" w:unhideWhenUsed="1"/>
+    <w:lsdException w:name="toc 2" w:semiHidden="1" w:uiPriority="39" w:unhideWhenUsed="1"/>
+    <w:lsdException w:name="toc 3" w:semiHidden="1" w:uiPriority="39" w:unhideWhenUsed="1"/>
+    <w:lsdException w:name="toc 4" w:semiHidden="1" w:uiPriority="39" w:unhideWhenUsed="1"/>
+    <w:lsdException w:name="toc 5" w:semiHidden="1" w:uiPriority="39" w:unhideWhenUsed="1"/>
+    <w:lsdException w:name="toc 6" w:semiHidden="1" w:uiPriority="39" w:unhideWhenUsed="1"/>
+    <w:lsdException w:name="toc 7" w:semiHidden="1" w:uiPriority="39" w:unhideWhenUsed="1"/>
+    <w:lsdException w:name="toc 8" w:semiHidden="1" w:uiPriority="39" w:unhideWhenUsed="1"/>
+    <w:lsdException w:name="toc 9" w:semiHidden="1" w:uiPriority="39" w:unhideWhenUsed="1"/>
+    <w:lsdException w:name="Normal Indent" w:semiHidden="1" w:unhideWhenUsed="1"/>
+    <w:lsdException w:name="footnote text" w:semiHidden="1" w:unhideWhenUsed="1"/>
+    <w:lsdException w:name="annotation text" w:semiHidden="1" w:unhideWhenUsed="1"/>
+    <w:lsdException w:name="header" w:semiHidden="1" w:unhideWhenUsed="1"/>
+    <w:lsdException w:name="footer" w:semiHidden="1" w:unhideWhenUsed="1"/>
+    <w:lsdException w:name="index heading" w:semiHidden="1" w:unhideWhenUsed="1"/>
+    <w:lsdException w:name="caption" w:semiHidden="1" w:uiPriority="35" w:unhideWhenUsed="1" w:qFormat="1"/>
+    <w:lsdException w:name="table of figures" w:semiHidden="1" w:unhideWhenUsed="1"/>
+    <w:lsdException w:name="envelope address" w:semiHidden="1" w:unhideWhenUsed="1"/>
+    <w:lsdException w:name="envelope return" w:semiHidden="1" w:unhideWhenUsed="1"/>
+    <w:lsdException w:name="footnote reference" w:semiHidden="1" w:unhideWhenUsed="1"/>
+    <w:lsdException w:name="annotation reference" w:semiHidden="1" w:unhideWhenUsed="1"/>
+    <w:lsdException w:name="line number" w:semiHidden="1" w:unhideWhenUsed="1"/>
+    <w:lsdException w:name="page number" w:semiHidden="1" w:unhideWhenUsed="1"/>
+    <w:lsdException w:name="endnote reference" w:semiHidden="1" w:unhideWhenUsed="1"/>
+    <w:lsdException w:name="endnote text" w:semiHidden="1" w:unhideWhenUsed="1"/>
+    <w:lsdException w:name="table of authorities" w:semiHidden="1" w:unhideWhenUsed="1"/>
+    <w:lsdException w:name="macro" w:semiHidden="1" w:unhideWhenUsed="1"/>
+    <w:lsdException w:name="toa heading" w:semiHidden="1" w:unhideWhenUsed="1"/>
+    <w:lsdException w:name="List" w:semiHidden="1" w:unhideWhenUsed="1"/>
+    <w:lsdException w:name="List Bullet" w:semiHidden="1" w:unhideWhenUsed="1"/>
+    <w:lsdException w:name="List Number" w:semiHidden="1" w:unhideWhenUsed="1"/>
+    <w:lsdException w:name="List 2" w:semiHidden="1" w:unhideWhenUsed="1"/>
+    <w:lsdException w:name="List 3" w:semiHidden="1" w:unhideWhenUsed="1"/>
+    <w:lsdException w:name="List 4" w:semiHidden="1" w:unhideWhenUsed="1"/>
+    <w:lsdException w:name="List 5" w:semiHidden="1" w:unhideWhenUsed="1"/>
+    <w:lsdException w:name="List Bullet 2" w:semiHidden="1" w:unhideWhenUsed="1"/>
+    <w:lsdException w:name="List Bullet 3" w:semiHidden="1" w:unhideWhenUsed="1"/>
+    <w:lsdException w:name="List Bullet 4" w:semiHidden="1" w:unhideWhenUsed="1"/>
+    <w:lsdException w:name="List Bullet 5" w:semiHidden="1" w:unhideWhenUsed="1"/>
+    <w:lsdException w:name="List Number 2" w:semiHidden="1" w:unhideWhenUsed="1"/>
+    <w:lsdException w:name="List Number 3" w:semiHidden="1" w:unhideWhenUsed="1"/>
+    <w:lsdException w:name="List Number 4" w:semiHidden="1" w:unhideWhenUsed="1"/>
+    <w:lsdException w:name="List Number 5" w:semiHidden="1" w:unhideWhenUsed="1"/>
+    <w:lsdException w:name="Title" w:uiPriority="10" w:qFormat="1"/>
+    <w:lsdException w:name="Closing" w:semiHidden="1" w:unhideWhenUsed="1"/>
+    <w:lsdException w:name="Signature" w:semiHidden="1" w:unhideWhenUsed="1"/>
+    <w:lsdException w:name="Default Paragraph Font" w:semiHidden="1" w:uiPriority="1" w:unhideWhenUsed="1"/>
+    <w:lsdException w:name="Body Text" w:semiHidden="1" w:unhideWhenUsed="1"/>
+    <w:lsdException w:name="Body Text Indent" w:semiHidden="1" w:unhideWhenUsed="1"/>
+    <w:lsdException w:name="List Continue" w:semiHidden="1" w:unhideWhenUsed="1"/>
+    <w:lsdException w:name="List Continue 2" w:semiHidden="1" w:unhideWhenUsed="1"/>
+    <w:lsdException w:name="List Continue 3" w:semiHidden="1" w:unhideWhenUsed="1"/>
+    <w:lsdException w:name="List Continue 4" w:semiHidden="1" w:unhideWhenUsed="1"/>
+    <w:lsdException w:name="List Continue 5" w:semiHidden="1" w:unhideWhenUsed="1"/>
+    <w:lsdException w:name="Message Header" w:semiHidden="1" w:unhideWhenUsed="1"/>
+    <w:lsdException w:name="Subtitle" w:uiPriority="11" w:qFormat="1"/>
+    <w:lsdException w:name="Salutation" w:semiHidden="1" w:unhideWhenUsed="1"/>
+    <w:lsdException w:name="Date" w:semiHidden="1" w:unhideWhenUsed="1"/>
+    <w:lsdException w:name="Body Text First Indent" w:semiHidden="1" w:unhideWhenUsed="1"/>
+    <w:lsdException w:name="Body Text First Indent 2" w:semiHidden="1" w:unhideWhenUsed="1"/>
+    <w:lsdException w:name="Note Heading" w:semiHidden="1" w:unhideWhenUsed="1"/>
+    <w:lsdException w:name="Body Text 2" w:semiHidden="1" w:unhideWhenUsed="1"/>
+    <w:lsdException w:name="Body Text 3" w:semiHidden="1" w:unhideWhenUsed="1"/>
+    <w:lsdException w:name="Body Text Indent 2" w:semiHidden="1" w:unhideWhenUsed="1"/>
+    <w:lsdException w:name="Body Text Indent 3" w:semiHidden="1" w:unhideWhenUsed="1"/>
+    <w:lsdException w:name="Block Text" w:semiHidden="1" w:unhideWhenUsed="1"/>
+    <w:lsdException w:name="Hyperlink" w:semiHidden="1" w:unhideWhenUsed="1"/>
+    <w:lsdException w:name="FollowedHyperlink" w:semiHidden="1" w:unhideWhenUsed="1"/>
+    <w:lsdException w:name="Strong" w:uiPriority="22" w:qFormat="1"/>
+    <w:lsdException w:name="Emphasis" w:uiPriority="20" w:qFormat="1"/>
+    <w:lsdException w:name="Document Map" w:semiHidden="1" w:unhideWhenUsed="1"/>
+    <w:lsdException w:name="Plain Text" w:semiHidden="1" w:unhideWhenUsed="1"/>
+    <w:lsdException w:name="E-mail Signature" w:semiHidden="1" w:unhideWhenUsed="1"/>
+    <w:lsdException w:name="HTML Top of Form" w:semiHidden="1" w:unhideWhenUsed="1"/>
+    <w:lsdException w:name="HTML Bottom of Form" w:semiHidden="1" w:unhideWhenUsed="1"/>
+    <w:lsdException w:name="Normal (Web)" w:semiHidden="1" w:unhideWhenUsed="1"/>
+    <w:lsdException w:name="HTML Acronym" w:semiHidden="1" w:unhideWhenUsed="1"/>
+    <w:lsdException w:name="HTML Address" w:semiHidden="1" w:unhideWhenUsed="1"/>
+    <w:lsdException w:name="HTML Cite" w:semiHidden="1" w:unhideWhenUsed="1"/>
+    <w:lsdException w:name="HTML Code" w:semiHidden="1" w:unhideWhenUsed="1"/>
+    <w:lsdException w:name="HTML Definition" w:semiHidden="1" w:unhideWhenUsed="1"/>
+    <w:lsdException w:name="HTML Keyboard" w:semiHidden="1" w:unhideWhenUsed="1"/>
+    <w:lsdException w:name="HTML Preformatted" w:semiHidden="1" w:unhideWhenUsed="1"/>
+    <w:lsdException w:name="HTML Sample" w:semiHidden="1" w:unhideWhenUsed="1"/>
+    <w:lsdException w:name="HTML Typewriter" w:semiHidden="1" w:unhideWhenUsed="1"/>
+    <w:lsdException w:name="HTML Variable" w:semiHidden="1" w:unhideWhenUsed="1"/>
+    <w:lsdException w:name="Normal Table" w:semiHidden="1" w:unhideWhenUsed="1"/>
+    <w:lsdException w:name="annotation subject" w:semiHidden="1" w:unhideWhenUsed="1"/>
+    <w:lsdException w:name="No List" w:semiHidden="1" w:unhideWhenUsed="1"/>
+    <w:lsdException w:name="Outline List 1" w:semiHidden="1" w:unhideWhenUsed="1"/>
+    <w:lsdException w:name="Outline List 2" w:semiHidden="1" w:unhideWhenUsed="1"/>
+    <w:lsdException w:name="Outline List 3" w:semiHidden="1" w:unhideWhenUsed="1"/>
+    <w:lsdException w:name="Table Simple 1" w:semiHidden="1" w:unhideWhenUsed="1"/>
+    <w:lsdException w:name="Table Simple 2" w:semiHidden="1" w:unhideWhenUsed="1"/>
+    <w:lsdException w:name="Table Simple 3" w:semiHidden="1" w:unhideWhenUsed="1"/>
+    <w:lsdException w:name="Table Classic 1" w:semiHidden="1" w:unhideWhenUsed="1"/>
+    <w:lsdException w:name="Table Classic 2" w:semiHidden="1" w:unhideWhenUsed="1"/>
+    <w:lsdException w:name="Table Classic 3" w:semiHidden="1" w:unhideWhenUsed="1"/>
+    <w:lsdException w:name="Table Classic 4" w:semiHidden="1" w:unhideWhenUsed="1"/>
+    <w:lsdException w:name="Table Colorful 1" w:semiHidden="1" w:unhideWhenUsed="1"/>
+    <w:lsdException w:name="Table Colorful 2" w:semiHidden="1" w:unhideWhenUsed="1"/>
+    <w:lsdException w:name="Table Colorful 3" w:semiHidden="1" w:unhideWhenUsed="1"/>
+    <w:lsdException w:name="Table Columns 1" w:semiHidden="1" w:unhideWhenUsed="1"/>
+    <w:lsdException w:name="Table Columns 2" w:semiHidden="1" w:unhideWhenUsed="1"/>
+    <w:lsdException w:name="Table Columns 3" w:semiHidden="1" w:unhideWhenUsed="1"/>
+    <w:lsdException w:name="Table Columns 4" w:semiHidden="1" w:unhideWhenUsed="1"/>
+    <w:lsdException w:name="Table Columns 5" w:semiHidden="1" w:unhideWhenUsed="1"/>
+    <w:lsdException w:name="Table Grid 1" w:semiHidden="1" w:unhideWhenUsed="1"/>
+    <w:lsdException w:name="Table Grid 2" w:semiHidden="1" w:unhideWhenUsed="1"/>
+    <w:lsdException w:name="Table Grid 3" w:semiHidden="1" w:unhideWhenUsed="1"/>
+    <w:lsdException w:name="Table Grid 4" w:semiHidden="1" w:unhideWhenUsed="1"/>
+    <w:lsdException w:name="Table Grid 5" w:semiHidden="1" w:unhideWhenUsed="1"/>
+    <w:lsdException w:name="Table Grid 6" w:semiHidden="1" w:unhideWhenUsed="1"/>
+    <w:lsdException w:name="Table Grid 7" w:semiHidden="1" w:unhideWhenUsed="1"/>
+    <w:lsdException w:name="Table Grid 8" w:semiHidden="1" w:unhideWhenUsed="1"/>
+    <w:lsdException w:name="Table List 1" w:semiHidden="1" w:unhideWhenUsed="1"/>
+    <w:lsdException w:name="Table List 2" w:semiHidden="1" w:unhideWhenUsed="1"/>
+    <w:lsdException w:name="Table List 3" w:semiHidden="1" w:unhideWhenUsed="1"/>
+    <w:lsdException w:name="Table List 4" w:semiHidden="1" w:unhideWhenUsed="1"/>
+    <w:lsdException w:name="Table List 5" w:semiHidden="1" w:unhideWhenUsed="1"/>
+    <w:lsdException w:name="Table List 6" w:semiHidden="1" w:unhideWhenUsed="1"/>
+    <w:lsdException w:name="Table List 7" w:semiHidden="1" w:unhideWhenUsed="1"/>
+    <w:lsdException w:name="Table List 8" w:semiHidden="1" w:unhideWhenUsed="1"/>
+    <w:lsdException w:name="Table 3D effects 1" w:semiHidden="1" w:unhideWhenUsed="1"/>
+    <w:lsdException w:name="Table 3D effects 2" w:semiHidden="1" w:unhideWhenUsed="1"/>
+    <w:lsdException w:name="Table 3D effects 3" w:semiHidden="1" w:unhideWhenUsed="1"/>
+    <w:lsdException w:name="Table Contemporary" w:semiHidden="1" w:unhideWhenUsed="1"/>
+    <w:lsdException w:name="Table Elegant" w:semiHidden="1" w:unhideWhenUsed="1"/>
+    <w:lsdException w:name="Table Professional" w:semiHidden="1" w:unhideWhenUsed="1"/>
+    <w:lsdException w:name="Table Subtle 1" w:semiHidden="1" w:unhideWhenUsed="1"/>
+    <w:lsdException w:name="Table Subtle 2" w:semiHidden="1" w:unhideWhenUsed="1"/>
+    <w:lsdException w:name="Table Web 1" w:semiHidden="1" w:unhideWhenUsed="1"/>
+    <w:lsdException w:name="Table Web 2" w:semiHidden="1" w:unhideWhenUsed="1"/>
+    <w:lsdException w:name="Table Web 3" w:semiHidden="1" w:unhideWhenUsed="1"/>
+    <w:lsdException w:name="Balloon Text" w:semiHidden="1" w:unhideWhenUsed="1"/>
+    <w:lsdException w:name="Table Grid" w:uiPriority="39"/>
+    <w:lsdException w:name="Table Theme" w:semiHidden="1" w:unhideWhenUsed="1"/>
+    <w:lsdException w:name="Placeholder Text" w:semiHidden="1"/>
+    <w:lsdException w:name="No Spacing" w:uiPriority="1" w:qFormat="1"/>
+    <w:lsdException w:name="Light Shading" w:uiPriority="60"/>
+    <w:lsdException w:name="Light List" w:uiPriority="61"/>
+    <w:lsdException w:name="Light Grid" w:uiPriority="62"/>
+    <w:lsdException w:name="Medium Shading 1" w:uiPriority="63"/>
+    <w:lsdException w:name="Medium Shading 2" w:uiPriority="64"/>
+    <w:lsdException w:name="Medium List 1" w:uiPriority="65"/>
+    <w:lsdException w:name="Medium List 2" w:uiPriority="66"/>
+    <w:lsdException w:name="Medium Grid 1" w:uiPriority="67"/>
+    <w:lsdException w:name="Medium Grid 2" w:uiPriority="68"/>
+    <w:lsdException w:name="Medium Grid 3" w:uiPriority="69"/>
+    <w:lsdException w:name="Dark List" w:uiPriority="70"/>
+    <w:lsdException w:name="Colorful Shading" w:uiPriority="71"/>
+    <w:lsdException w:name="Colorful List" w:uiPriority="72"/>
+    <w:lsdException w:name="Colorful Grid" w:uiPriority="73"/>
+    <w:lsdException w:name="Light Shading Accent 1" w:uiPriority="60"/>
+    <w:lsdException w:name="Light List Accent 1" w:uiPriority="61"/>
+    <w:lsdException w:name="Light Grid Accent 1" w:uiPriority="62"/>
+    <w:lsdException w:name="Medium Shading 1 Accent 1" w:uiPriority="63"/>
+    <w:lsdException w:name="Medium Shading 2 Accent 1" w:uiPriority="64"/>
+    <w:lsdException w:name="Medium List 1 Accent 1" w:uiPriority="65"/>
+    <w:lsdException w:name="Revision" w:semiHidden="1"/>
+    <w:lsdException w:name="List Paragraph" w:uiPriority="34" w:qFormat="1"/>
+    <w:lsdException w:name="Quote" w:uiPriority="29" w:qFormat="1"/>
+    <w:lsdException w:name="Intense Quote" w:uiPriority="30" w:qFormat="1"/>
+    <w:lsdException w:name="Medium List 2 Accent 1" w:uiPriority="66"/>
+    <w:lsdException w:name="Medium Grid 1 Accent 1" w:uiPriority="67"/>
+    <w:lsdException w:name="Medium Grid 2 Accent 1" w:uiPriority="68"/>
+    <w:lsdException w:name="Medium Grid 3 Accent 1" w:uiPriority="69"/>
+    <w:lsdException w:name="Dark List Accent 1" w:uiPriority="70"/>
+    <w:lsdException w:name="Colorful Shading Accent 1" w:uiPriority="71"/>
+    <w:lsdException w:name="Colorful List Accent 1" w:uiPriority="72"/>
+    <w:lsdException w:name="Colorful Grid Accent 1" w:uiPriority="73"/>
+    <w:lsdException w:name="Light Shading Accent 2" w:uiPriority="60"/>
+    <w:lsdException w:name="Light List Accent 2" w:uiPriority="61"/>
+    <w:lsdException w:name="Light Grid Accent 2" w:uiPriority="62"/>
+    <w:lsdException w:name="Medium Shading 1 Accent 2" w:uiPriority="63"/>
+    <w:lsdException w:name="Medium Shading 2 Accent 2" w:uiPriority="64"/>
+    <w:lsdException w:name="Medium List 1 Accent 2" w:uiPriority="65"/>
+    <w:lsdException w:name="Medium List 2 Accent 2" w:uiPriority="66"/>
+    <w:lsdException w:name="Medium Grid 1 Accent 2" w:uiPriority="67"/>
+    <w:lsdException w:name="Medium Grid 2 Accent 2" w:uiPriority="68"/>
+    <w:lsdException w:name="Medium Grid 3 Accent 2" w:uiPriority="69"/>
+    <w:lsdException w:name="Dark List Accent 2" w:uiPriority="70"/>
+    <w:lsdException w:name="Colorful Shading Accent 2" w:uiPriority="71"/>
+    <w:lsdException w:name="Colorful List Accent 2" w:uiPriority="72"/>
+    <w:lsdException w:name="Colorful Grid Accent 2" w:uiPriority="73"/>
+    <w:lsdException w:name="Light Shading Accent 3" w:uiPriority="60"/>
+    <w:lsdException w:name="Light List Accent 3" w:uiPriority="61"/>
+    <w:lsdException w:name="Light Grid Accent 3" w:uiPriority="62"/>
+    <w:lsdException w:name="Medium Shading 1 Accent 3" w:uiPriority="63"/>
+    <w:lsdException w:name="Medium Shading 2 Accent 3" w:uiPriority="64"/>
+    <w:lsdException w:name="Medium List 1 Accent 3" w:uiPriority="65"/>
+    <w:lsdException w:name="Medium List 2 Accent 3" w:uiPriority="66"/>
+    <w:lsdException w:name="Medium Grid 1 Accent 3" w:uiPriority="67"/>
+    <w:lsdException w:name="Medium Grid 2 Accent 3" w:uiPriority="68"/>
+    <w:lsdException w:name="Medium Grid 3 Accent 3" w:uiPriority="69"/>
+    <w:lsdException w:name="Dark List Accent 3" w:uiPriority="70"/>
+    <w:lsdException w:name="Colorful Shading Accent 3" w:uiPriority="71"/>
+    <w:lsdException w:name="Colorful List Accent 3" w:uiPriority="72"/>
+    <w:lsdException w:name="Colorful Grid Accent 3" w:uiPriority="73"/>
+    <w:lsdException w:name="Light Shading Accent 4" w:uiPriority="60"/>
+    <w:lsdException w:name="Light List Accent 4" w:uiPriority="61"/>
+    <w:lsdException w:name="Light Grid Accent 4" w:uiPriority="62"/>
+    <w:lsdException w:name="Medium Shading 1 Accent 4" w:uiPriority="63"/>
+    <w:lsdException w:name="Medium Shading 2 Accent 4" w:uiPriority="64"/>
+    <w:lsdException w:name="Medium List 1 Accent 4" w:uiPriority="65"/>
+    <w:lsdException w:name="Medium List 2 Accent 4" w:uiPriority="66"/>
+    <w:lsdException w:name="Medium Grid 1 Accent 4" w:uiPriority="67"/>
+    <w:lsdException w:name="Medium Grid 2 Accent 4" w:uiPriority="68"/>
+    <w:lsdException w:name="Medium Grid 3 Accent 4" w:uiPriority="69"/>
+    <w:lsdException w:name="Dark List Accent 4" w:uiPriority="70"/>
+    <w:lsdException w:name="Colorful Shading Accent 4" w:uiPriority="71"/>
+    <w:lsdException w:name="Colorful List Accent 4" w:uiPriority="72"/>
+    <w:lsdException w:name="Colorful Grid Accent 4" w:uiPriority="73"/>
+    <w:lsdException w:name="Light Shading Accent 5" w:uiPriority="60"/>
+    <w:lsdException w:name="Light List Accent 5" w:uiPriority="61"/>
+    <w:lsdException w:name="Light Grid Accent 5" w:uiPriority="62"/>
+    <w:lsdException w:name="Medium Shading 1 Accent 5" w:uiPriority="63"/>
+    <w:lsdException w:name="Medium Shading 2 Accent 5" w:uiPriority="64"/>
+    <w:lsdException w:name="Medium List 1 Accent 5" w:uiPriority="65"/>
+    <w:lsdException w:name="Medium List 2 Accent 5" w:uiPriority="66"/>
+    <w:lsdException w:name="Medium Grid 1 Accent 5" w:uiPriority="67"/>
+    <w:lsdException w:name="Medium Grid 2 Accent 5" w:uiPriority="68"/>
+    <w:lsdException w:name="Medium Grid 3 Accent 5" w:uiPriority="69"/>
+    <w:lsdException w:name="Dark List Accent 5" w:uiPriority="70"/>
+    <w:lsdException w:name="Colorful Shading Accent 5" w:uiPriority="71"/>
+    <w:lsdException w:name="Colorful List Accent 5" w:uiPriority="72"/>
+    <w:lsdException w:name="Colorful Grid Accent 5" w:uiPriority="73"/>
+    <w:lsdException w:name="Light Shading Accent 6" w:uiPriority="60"/>
+    <w:lsdException w:name="Light List Accent 6" w:uiPriority="61"/>
+    <w:lsdException w:name="Light Grid Accent 6" w:uiPriority="62"/>
+    <w:lsdException w:name="Medium Shading 1 Accent 6" w:uiPriority="63"/>
+    <w:lsdException w:name="Medium Shading 2 Accent 6" w:uiPriority="64"/>
+    <w:lsdException w:name="Medium List 1 Accent 6" w:uiPriority="65"/>
+    <w:lsdException w:name="Medium List 2 Accent 6" w:uiPriority="66"/>
+    <w:lsdException w:name="Medium Grid 1 Accent 6" w:uiPriority="67"/>
+    <w:lsdException w:name="Medium Grid 2 Accent 6" w:uiPriority="68"/>
+    <w:lsdException w:name="Medium Grid 3 Accent 6" w:uiPriority="69"/>
+    <w:lsdException w:name="Dark List Accent 6" w:uiPriority="70"/>
+    <w:lsdException w:name="Colorful Shading Accent 6" w:uiPriority="71"/>
+    <w:lsdException w:name="Colorful List Accent 6" w:uiPriority="72"/>
+    <w:lsdException w:name="Colorful Grid Accent 6" w:uiPriority="73"/>
+    <w:lsdException w:name="Subtle Emphasis" w:uiPriority="19" w:qFormat="1"/>
+    <w:lsdException w:name="Intense Emphasis" w:uiPriority="21" w:qFormat="1"/>
+    <w:lsdException w:name="Subtle Reference" w:uiPriority="31" w:qFormat="1"/>
+    <w:lsdException w:name="Intense Reference" w:uiPriority="32" w:qFormat="1"/>
+    <w:lsdException w:name="Book Title" w:uiPriority="33" w:qFormat="1"/>
+    <w:lsdException w:name="Bibliography" w:semiHidden="1" w:uiPriority="37" w:unhideWhenUsed="1"/>
+    <w:lsdException w:name="TOC Heading" w:semiHidden="1" w:uiPriority="39" w:unhideWhenUsed="1" w:qFormat="1"/>
+    <w:lsdException w:name="Plain Table 1" w:uiPriority="41"/>
+    <w:lsdException w:name="Plain Table 2" w:uiPriority="42"/>
+    <w:lsdException w:name="Plain Table 3" w:uiPriority="43"/>
+    <w:lsdException w:name="Plain Table 4" w:uiPriority="44"/>
+    <w:lsdException w:name="Plain Table 5" w:uiPriority="45"/>
+    <w:lsdException w:name="Grid Table Light" w:uiPriority="40"/>
+    <w:lsdException w:name="Grid Table 1 Light" w:uiPriority="46"/>
+    <w:lsdException w:name="Grid Table 2" w:uiPriority="47"/>
+    <w:lsdException w:name="Grid Table 3" w:uiPriority="48"/>
+    <w:lsdException w:name="Grid Table 4" w:uiPriority="49"/>
+    <w:lsdException w:name="Grid Table 5 Dark" w:uiPriority="50"/>
+    <w:lsdException w:name="Grid Table 6 Colorful" w:uiPriority="51"/>
+    <w:lsdException w:name="Grid Table 7 Colorful" w:uiPriority="52"/>
+    <w:lsdException w:name="Grid Table 1 Light Accent 1" w:uiPriority="46"/>
+    <w:lsdException w:name="Grid Table 2 Accent 1" w:uiPriority="47"/>
+    <w:lsdException w:name="Grid Table 3 Accent 1" w:uiPriority="48"/>
+    <w:lsdException w:name="Grid Table 4 Accent 1" w:uiPriority="49"/>
+    <w:lsdException w:name="Grid Table 5 Dark Accent 1" w:uiPriority="50"/>
+    <w:lsdException w:name="Grid Table 6 Colorful Accent 1" w:uiPriority="51"/>
+    <w:lsdException w:name="Grid Table 7 Colorful Accent 1" w:uiPriority="52"/>
+    <w:lsdException w:name="Grid Table 1 Light Accent 2" w:uiPriority="46"/>
+    <w:lsdException w:name="Grid Table 2 Accent 2" w:uiPriority="47"/>
+    <w:lsdException w:name="Grid Table 3 Accent 2" w:uiPriority="48"/>
+    <w:lsdException w:name="Grid Table 4 Accent 2" w:uiPriority="49"/>
+    <w:lsdException w:name="Grid Table 5 Dark Accent 2" w:uiPriority="50"/>
+    <w:lsdException w:name="Grid Table 6 Colorful Accent 2" w:uiPriority="51"/>
+    <w:lsdException w:name="Grid Table 7 Colorful Accent 2" w:uiPriority="52"/>
+    <w:lsdException w:name="Grid Table 1 Light Accent 3" w:uiPriority="46"/>
+    <w:lsdException w:name="Grid Table 2 Accent 3" w:uiPriority="47"/>
+    <w:lsdException w:name="Grid Table 3 Accent 3" w:uiPriority="48"/>
+    <w:lsdException w:name="Grid Table 4 Accent 3" w:uiPriority="49"/>
+    <w:lsdException w:name="Grid Table 5 Dark Accent 3" w:uiPriority="50"/>
+    <w:lsdException w:name="Grid Table 6 Colorful Accent 3" w:uiPriority="51"/>
+    <w:lsdException w:name="Grid Table 7 Colorful Accent 3" w:uiPriority="52"/>
+    <w:lsdException w:name="Grid Table 1 Light Accent 4" w:uiPriority="46"/>
+    <w:lsdException w:name="Grid Table 2 Accent 4" w:uiPriority="47"/>
+    <w:lsdException w:name="Grid Table 3 Accent 4" w:uiPriority="48"/>
+    <w:lsdException w:name="Grid Table 4 Accent 4" w:uiPriority="49"/>
+    <w:lsdException w:name="Grid Table 5 Dark Accent 4" w:uiPriority="50"/>
+    <w:lsdException w:name="Grid Table 6 Colorful Accent 4" w:uiPriority="51"/>
+    <w:lsdException w:name="Grid Table 7 Colorful Accent 4" w:uiPriority="52"/>
+    <w:lsdException w:name="Grid Table 1 Light Accent 5" w:uiPriority="46"/>
+    <w:lsdException w:name="Grid Table 2 Accent 5" w:uiPriority="47"/>
+    <w:lsdException w:name="Grid Table 3 Accent 5" w:uiPriority="48"/>
+    <w:lsdException w:name="Grid Table 4 Accent 5" w:uiPriority="49"/>
+    <w:lsdException w:name="Grid Table 5 Dark Accent 5" w:uiPriority="50"/>
+    <w:lsdException w:name="Grid Table 6 Colorful Accent 5" w:uiPriority="51"/>
+    <w:lsdException w:name="Grid Table 7 Colorful Accent 5" w:uiPriority="52"/>
+    <w:lsdException w:name="Grid Table 1 Light Accent 6" w:uiPriority="46"/>
+    <w:lsdException w:name="Grid Table 2 Accent 6" w:uiPriority="47"/>
+    <w:lsdException w:name="Grid Table 3 Accent 6" w:uiPriority="48"/>
+    <w:lsdException w:name="Grid Table 4 Accent 6" w:uiPriority="49"/>
+    <w:lsdException w:name="Grid Table 5 Dark Accent 6" w:uiPriority="50"/>
+    <w:lsdException w:name="Grid Table 6 Colorful Accent 6" w:uiPriority="51"/>
+    <w:lsdException w:name="Grid Table 7 Colorful Accent 6" w:uiPriority="52"/>
+    <w:lsdException w:name="List Table 1 Light" w:uiPriority="46"/>
+    <w:lsdException w:name="List Table 2" w:uiPriority="47"/>
+    <w:lsdException w:name="List Table 3" w:uiPriority="48"/>
+    <w:lsdException w:name="List Table 4" w:uiPriority="49"/>
+    <w:lsdException w:name="List Table 5 Dark" w:uiPriority="50"/>
+    <w:lsdException w:name="List Table 6 Colorful" w:uiPriority="51"/>
+    <w:lsdException w:name="List Table 7 Colorful" w:uiPriority="52"/>
+    <w:lsdException w:name="List Table 1 Light Accent 1" w:uiPriority="46"/>
+    <w:lsdException w:name="List Table 2 Accent 1" w:uiPriority="47"/>
+    <w:lsdException w:name="List Table 3 Accent 1" w:uiPriority="48"/>
+    <w:lsdException w:name="List Table 4 Accent 1" w:uiPriority="49"/>
+    <w:lsdException w:name="List Table 5 Dark Accent 1" w:uiPriority="50"/>
+    <w:lsdException w:name="List Table 6 Colorful Accent 1" w:uiPriority="51"/>
+    <w:lsdException w:name="List Table 7 Colorful Accent 1" w:uiPriority="52"/>
+    <w:lsdException w:name="List Table 1 Light Accent 2" w:uiPriority="46"/>
+    <w:lsdException w:name="List Table 2 Accent 2" w:uiPriority="47"/>
+    <w:lsdException w:name="List Table 3 Accent 2" w:uiPriority="48"/>
+    <w:lsdException w:name="List Table 4 Accent 2" w:uiPriority="49"/>
+    <w:lsdException w:name="List Table 5 Dark Accent 2" w:uiPriority="50"/>
+    <w:lsdException w:name="List Table 6 Colorful Accent 2" w:uiPriority="51"/>
+    <w:lsdException w:name="List Table 7 Colorful Accent 2" w:uiPriority="52"/>
+    <w:lsdException w:name="List Table 1 Light Accent 3" w:uiPriority="46"/>
+    <w:lsdException w:name="List Table 2 Accent 3" w:uiPriority="47"/>
+    <w:lsdException w:name="List Table 3 Accent 3" w:uiPriority="48"/>
+    <w:lsdException w:name="List Table 4 Accent 3" w:uiPriority="49"/>
+    <w:lsdException w:name="List Table 5 Dark Accent 3" w:uiPriority="50"/>
+    <w:lsdException w:name="List Table 6 Colorful Accent 3" w:uiPriority="51"/>
+    <w:lsdException w:name="List Table 7 Colorful Accent 3" w:uiPriority="52"/>
+    <w:lsdException w:name="List Table 1 Light Accent 4" w:uiPriority="46"/>
+    <w:lsdException w:name="List Table 2 Accent 4" w:uiPriority="47"/>
+    <w:lsdException w:name="List Table 3 Accent 4" w:uiPriority="48"/>
+    <w:lsdException w:name="List Table 4 Accent 4" w:uiPriority="49"/>
+    <w:lsdException w:name="List Table 5 Dark Accent 4" w:uiPriority="50"/>
+    <w:lsdException w:name="List Table 6 Colorful Accent 4" w:uiPriority="51"/>
+    <w:lsdException w:name="List Table 7 Colorful Accent 4" w:uiPriority="52"/>
+    <w:lsdException w:name="List Table 1 Light Accent 5" w:uiPriority="46"/>
+    <w:lsdException w:name="List Table 2 Accent 5" w:uiPriority="47"/>
+    <w:lsdException w:name="List Table 3 Accent 5" w:uiPriority="48"/>
+    <w:lsdException w:name="List Table 4 Accent 5" w:uiPriority="49"/>
+    <w:lsdException w:name="List Table 5 Dark Accent 5" w:uiPriority="50"/>
+    <w:lsdException w:name="List Table 6 Colorful Accent 5" w:uiPriority="51"/>
+    <w:lsdException w:name="List Table 7 Colorful Accent 5" w:uiPriority="52"/>
+    <w:lsdException w:name="List Table 1 Light Accent 6" w:uiPriority="46"/>
+    <w:lsdException w:name="List Table 2 Accent 6" w:uiPriority="47"/>
+    <w:lsdException w:name="List Table 3 Accent 6" w:uiPriority="48"/>
+    <w:lsdException w:name="List Table 4 Accent 6" w:uiPriority="49"/>
+    <w:lsdException w:name="List Table 5 Dark Accent 6" w:uiPriority="50"/>
+    <w:lsdException w:name="List Table 6 Colorful Accent 6" w:uiPriority="51"/>
+    <w:lsdException w:name="List Table 7 Colorful Accent 6" w:uiPriority="52"/>
+    <w:lsdException w:name="Mention" w:semiHidden="1" w:unhideWhenUsed="1"/>
+    <w:lsdException w:name="Smart Hyperlink" w:semiHidden="1" w:unhideWhenUsed="1"/>
+    <w:lsdException w:name="Hashtag" w:semiHidden="1" w:unhideWhenUsed="1"/>
+    <w:lsdException w:name="Unresolved Mention" w:semiHidden="1" w:unhideWhenUsed="1"/>
+    <w:lsdException w:name="Smart Link" w:semiHidden="1" w:unhideWhenUsed="1"/>
+  </w:latentStyles>
+  <w:style w:type="paragraph" w:default="1" w:styleId="Normal">
+    <w:name w:val="Normal"/>
+    <w:qFormat/>
+  </w:style>
+  <w:style w:type="paragraph" w:styleId="Heading1">
+    <w:name w:val="heading 1"/>
+    <w:basedOn w:val="Normal"/>
+    <w:next w:val="Normal"/>
+    <w:link w:val="Heading1Char"/>
+    <w:uiPriority w:val="9"/>
+    <w:qFormat/>
+    <w:pPr>
+      <w:keepNext/>
+      <w:keepLines/>
+      <w:spacing w:before="360" w:after="180"/>
+      <w:outlineLvl w:val="0"/>
+    </w:pPr>
+    <w:rPr>
+      <w:color w:val="182940"/>
+      <w:sz w:val="36"/>
+      <w:szCs w:val="36"/>
+    </w:rPr>
+  </w:style>
+  <w:style w:type="paragraph" w:styleId="Heading2">
+    <w:name w:val="heading 2"/>
+    <w:basedOn w:val="Normal"/>
+    <w:next w:val="Normal"/>
+    <w:link w:val="Heading2Char"/>
+    <w:uiPriority w:val="9"/>
+    <w:semiHidden/>
+    <w:unhideWhenUsed/>
+    <w:qFormat/>
+    <w:pPr>
+      <w:keepNext/>
+      <w:keepLines/>
+      <w:spacing w:before="280" w:after="140"/>
+      <w:outlineLvl w:val="1"/>
+    </w:pPr>
+    <w:rPr>
+      <w:color w:val="182940"/>
+      <w:sz w:val="32"/>
+      <w:szCs w:val="32"/>
+    </w:rPr>
+  </w:style>
+  <w:style w:type="paragraph" w:styleId="Heading3">
+    <w:name w:val="heading 3"/>
+    <w:basedOn w:val="Normal"/>
+    <w:next w:val="Normal"/>
+    <w:link w:val="Heading3Char"/>
+    <w:uiPriority w:val="9"/>
+    <w:semiHidden/>
+    <w:unhideWhenUsed/>
+    <w:qFormat/>
+    <w:pPr>
+      <w:keepNext/>
+      <w:keepLines/>
+      <w:spacing w:before="240" w:after="120"/>
+      <w:outlineLvl w:val="2"/>
+    </w:pPr>
+    <w:rPr>
+      <w:color w:val="182940"/>
+      <w:sz w:val="28"/>
+      <w:szCs w:val="28"/>
+    </w:rPr>
+  </w:style>
+  <w:style w:type="paragraph" w:styleId="Heading4">
+    <w:name w:val="heading 4"/>
+    <w:basedOn w:val="Normal"/>
+    <w:next w:val="Normal"/>
+    <w:link w:val="Heading4Char"/>
+    <w:uiPriority w:val="9"/>
+    <w:semiHidden/>
+    <w:unhideWhenUsed/>
+    <w:qFormat/>
+    <w:pPr>
+      <w:keepNext/>
+      <w:keepLines/>
+      <w:spacing w:before="80" w:after="40"/>
+      <w:outlineLvl w:val="3"/>
+    </w:pPr>
+    <w:rPr>
+      <w:i/>
+      <w:iCs/>
+      <w:color w:val="182940"/>
+    </w:rPr>
+  </w:style>
+  <w:style w:type="paragraph" w:styleId="Heading5">
+    <w:name w:val="heading 5"/>
+    <w:basedOn w:val="Normal"/>
+    <w:next w:val="Normal"/>
+    <w:link w:val="Heading5Char"/>
+    <w:uiPriority w:val="9"/>
+    <w:semiHidden/>
+    <w:unhideWhenUsed/>
+    <w:qFormat/>
+    <w:pPr>
+      <w:keepNext/>
+      <w:keepLines/>
+      <w:spacing w:before="80" w:after="40"/>
+      <w:outlineLvl w:val="4"/>
+    </w:pPr>
+    <w:rPr>
+      <w:color w:val="182940"/>
+    </w:rPr>
+  </w:style>
+  <w:style w:type="paragraph" w:styleId="Heading6">
+    <w:name w:val="heading 6"/>
+    <w:basedOn w:val="Normal"/>
+    <w:next w:val="Normal"/>
+    <w:link w:val="Heading6Char"/>
+    <w:uiPriority w:val="9"/>
+    <w:semiHidden/>
+    <w:unhideWhenUsed/>
+    <w:qFormat/>
+    <w:pPr>
+      <w:keepNext/>
+      <w:keepLines/>
+      <w:spacing w:before="40" w:after="0"/>
+      <w:outlineLvl w:val="5"/>
+    </w:pPr>
+    <w:rPr>
+      <w:i/>
+      <w:iCs/>
+      <w:color w:val="182940"/>
+    </w:rPr>
+  </w:style>
+  <w:style w:type="paragraph" w:styleId="Heading7">
+    <w:name w:val="heading 7"/>
+    <w:basedOn w:val="Normal"/>
+    <w:next w:val="Normal"/>
+    <w:link w:val="Heading7Char"/>
+    <w:uiPriority w:val="9"/>
+    <w:semiHidden/>
+    <w:unhideWhenUsed/>
+    <w:qFormat/>
+    <w:pPr>
+      <w:keepNext/>
+      <w:keepLines/>
+      <w:spacing w:before="40" w:after="0"/>
+      <w:outlineLvl w:val="6"/>
+    </w:pPr>
+    <w:rPr>
+      <w:color w:val="182940"/>
+    </w:rPr>
+  </w:style>
+  <w:style w:type="paragraph" w:styleId="Heading8">
+    <w:name w:val="heading 8"/>
+    <w:basedOn w:val="Normal"/>
+    <w:next w:val="Normal"/>
+    <w:link w:val="Heading8Char"/>
+    <w:uiPriority w:val="9"/>
+    <w:semiHidden/>
+    <w:unhideWhenUsed/>
+    <w:qFormat/>
+    <w:pPr>
+      <w:keepNext/>
+      <w:keepLines/>
+      <w:spacing w:after="0"/>
+      <w:outlineLvl w:val="7"/>
+    </w:pPr>
+    <w:rPr>
+      <w:i/>
+      <w:iCs/>
+      <w:color w:val="182940"/>
+    </w:rPr>
+  </w:style>
+  <w:style w:type="paragraph" w:styleId="Heading9">
+    <w:name w:val="heading 9"/>
+    <w:basedOn w:val="Normal"/>
+    <w:next w:val="Normal"/>
+    <w:link w:val="Heading9Char"/>
+    <w:uiPriority w:val="9"/>
+    <w:semiHidden/>
+    <w:unhideWhenUsed/>
+    <w:qFormat/>
+    <w:pPr>
+      <w:keepNext/>
+      <w:keepLines/>
+      <w:spacing w:after="0"/>
+      <w:outlineLvl w:val="8"/>
+    </w:pPr>
+    <w:rPr>
+      <w:color w:val="182940"/>
+    </w:rPr>
+  </w:style>
+  <w:style w:type="character" w:default="1" w:styleId="DefaultParagraphFont">
+    <w:name w:val="Default Paragraph Font"/>
+    <w:uiPriority w:val="1"/>
+    <w:semiHidden/>
+    <w:unhideWhenUsed/>
+  </w:style>
+  <w:style w:type="table" w:default="1" w:styleId="TableNormal">
+    <w:name w:val="Normal Table"/>
+    <w:uiPriority w:val="99"/>
+    <w:semiHidden/>
+    <w:unhideWhenUsed/>
+    <w:tblPr>
+      <w:tblInd w:w="0" w:type="dxa"/>
+      <w:tblCellMar>
+        <w:top w:w="0" w:type="dxa"/>
+        <w:left w:w="108" w:type="dxa"/>
+        <w:bottom w:w="0" w:type="dxa"/>
+        <w:right w:w="108" w:type="dxa"/>
+      </w:tblCellMar>
+    </w:tblPr>
+  </w:style>
+  <w:style w:type="numbering" w:default="1" w:styleId="NoList">
+    <w:name w:val="No List"/>
+    <w:uiPriority w:val="99"/>
+    <w:semiHidden/>
+    <w:unhideWhenUsed/>
+  </w:style>
+  <w:style w:type="character" w:customStyle="1" w:styleId="Heading1Char">
+    <w:name w:val="Heading 1 Char"/>
+    <w:basedOn w:val="DefaultParagraphFont"/>
+    <w:link w:val="Heading1"/>
+    <w:uiPriority w:val="9"/>
+    <w:rPr>
+      <w:rFonts w:ascii="Times New Roman" w:eastAsia="Times New Roman" w:hAnsi="Times New Roman" w:cs="Times New Roman"/>
+      <w:color w:val="182940"/>
+      <w:sz w:val="36"/>
+      <w:szCs w:val="36"/>
+    </w:rPr>
+  </w:style>
+  <w:style w:type="character" w:customStyle="1" w:styleId="Heading2Char">
+    <w:name w:val="Heading 2 Char"/>
+    <w:basedOn w:val="DefaultParagraphFont"/>
+    <w:link w:val="Heading2"/>
+    <w:uiPriority w:val="9"/>
+    <w:semiHidden/>
+    <w:rPr>
+      <w:rFonts w:ascii="Times New Roman" w:eastAsia="Times New Roman" w:hAnsi="Times New Roman" w:cs="Times New Roman"/>
+      <w:color w:val="182940"/>
+      <w:sz w:val="32"/>
+      <w:szCs w:val="32"/>
+    </w:rPr>
+  </w:style>
+  <w:style w:type="character" w:customStyle="1" w:styleId="Heading3Char">
+    <w:name w:val="Heading 3 Char"/>
+    <w:basedOn w:val="DefaultParagraphFont"/>
+    <w:link w:val="Heading3"/>
+    <w:uiPriority w:val="9"/>
+    <w:semiHidden/>
+    <w:rPr>
+      <w:rFonts w:ascii="Times New Roman" w:eastAsia="Times New Roman" w:hAnsi="Times New Roman" w:cs="Times New Roman"/>
+      <w:color w:val="182940"/>
+      <w:sz w:val="28"/>
+      <w:szCs w:val="28"/>
+    </w:rPr>
+  </w:style>
+  <w:style w:type="character" w:customStyle="1" w:styleId="Heading4Char">
+    <w:name w:val="Heading 4 Char"/>
+    <w:basedOn w:val="DefaultParagraphFont"/>
+    <w:link w:val="Heading4"/>
+    <w:uiPriority w:val="9"/>
+    <w:semiHidden/>
+    <w:rPr>
+      <w:rFonts w:ascii="Times New Roman" w:eastAsia="Times New Roman" w:hAnsi="Times New Roman" w:cs="Times New Roman"/>
+      <w:i/>
+      <w:iCs/>
+      <w:color w:val="182940"/>
+    </w:rPr>
+  </w:style>
+  <w:style w:type="character" w:customStyle="1" w:styleId="Heading5Char">
+    <w:name w:val="Heading 5 Char"/>
+    <w:basedOn w:val="DefaultParagraphFont"/>
+    <w:link w:val="Heading5"/>
+    <w:uiPriority w:val="9"/>
+    <w:semiHidden/>
+    <w:rPr>
+      <w:rFonts w:ascii="Times New Roman" w:eastAsia="Times New Roman" w:hAnsi="Times New Roman" w:cs="Times New Roman"/>
+      <w:color w:val="182940"/>
+    </w:rPr>
+  </w:style>
+  <w:style w:type="character" w:customStyle="1" w:styleId="Heading6Char">
+    <w:name w:val="Heading 6 Char"/>
+    <w:basedOn w:val="DefaultParagraphFont"/>
+    <w:link w:val="Heading6"/>
+    <w:uiPriority w:val="9"/>
+    <w:semiHidden/>
+    <w:rPr>
+      <w:rFonts w:ascii="Times New Roman" w:eastAsia="Times New Roman" w:hAnsi="Times New Roman" w:cs="Times New Roman"/>
+      <w:i/>
+      <w:iCs/>
+      <w:color w:val="182940"/>
+    </w:rPr>
+  </w:style>
+  <w:style w:type="character" w:customStyle="1" w:styleId="Heading7Char">
+    <w:name w:val="Heading 7 Char"/>
+    <w:basedOn w:val="DefaultParagraphFont"/>
+    <w:link w:val="Heading7"/>
+    <w:uiPriority w:val="9"/>
+    <w:semiHidden/>
+    <w:rPr>
+      <w:rFonts w:ascii="Times New Roman" w:eastAsia="Times New Roman" w:hAnsi="Times New Roman" w:cs="Times New Roman"/>
+      <w:color w:val="182940"/>
+    </w:rPr>
+  </w:style>
+  <w:style w:type="character" w:customStyle="1" w:styleId="Heading8Char">
+    <w:name w:val="Heading 8 Char"/>
+    <w:basedOn w:val="DefaultParagraphFont"/>
+    <w:link w:val="Heading8"/>
+    <w:uiPriority w:val="9"/>
+    <w:semiHidden/>
+    <w:rPr>
+      <w:rFonts w:ascii="Times New Roman" w:eastAsia="Times New Roman" w:hAnsi="Times New Roman" w:cs="Times New Roman"/>
+      <w:i/>
+      <w:iCs/>
+      <w:color w:val="182940"/>
+    </w:rPr>
+  </w:style>
+  <w:style w:type="character" w:customStyle="1" w:styleId="Heading9Char">
+    <w:name w:val="Heading 9 Char"/>
+    <w:basedOn w:val="DefaultParagraphFont"/>
+    <w:link w:val="Heading9"/>
+    <w:uiPriority w:val="9"/>
+    <w:semiHidden/>
+    <w:rPr>
+      <w:rFonts w:ascii="Times New Roman" w:eastAsia="Times New Roman" w:hAnsi="Times New Roman" w:cs="Times New Roman"/>
+      <w:color w:val="182940"/>
+    </w:rPr>
+  </w:style>
   <w:style w:type="paragraph" w:styleId="Title">
     <w:name w:val="Title"/>
     <w:basedOn w:val="Normal"/>
     <w:next w:val="Normal"/>
+    <w:link w:val="TitleChar"/>
+    <w:uiPriority w:val="10"/>
     <w:qFormat/>
-    <w:rPr>
-      <w:sz w:val="56"/>
-      <w:szCs w:val="56"/>
-    </w:rPr>
-  </w:style>
-  <w:style w:type="paragraph" w:styleId="Heading1">
-    <w:name w:val="Heading 1"/>
+    <w:pPr>
+      <w:spacing w:after="120" w:line="240" w:lineRule="auto"/>
+      <w:contextualSpacing/>
+      <w:jc w:val="center"/>
+    </w:pPr>
+    <w:rPr>
+      <w:b/>
+      <w:bCs/>
+      <w:color w:val="182940"/>
+      <w:kern w:val="28"/>
+      <w:sz w:val="40"/>
+      <w:szCs w:val="40"/>
+    </w:rPr>
+  </w:style>
+  <w:style w:type="character" w:customStyle="1" w:styleId="TitleChar">
+    <w:name w:val="Title Char"/>
+    <w:basedOn w:val="DefaultParagraphFont"/>
+    <w:link w:val="Title"/>
+    <w:uiPriority w:val="10"/>
+    <w:rPr>
+      <w:rFonts w:ascii="Times New Roman" w:eastAsia="Times New Roman" w:hAnsi="Times New Roman" w:cs="Times New Roman"/>
+      <w:b/>
+      <w:bCs/>
+      <w:color w:val="182940"/>
+      <w:kern w:val="28"/>
+      <w:sz w:val="40"/>
+      <w:szCs w:val="40"/>
+    </w:rPr>
+  </w:style>
+  <w:style w:type="paragraph" w:styleId="Subtitle">
+    <w:name w:val="Subtitle"/>
     <w:basedOn w:val="Normal"/>
     <w:next w:val="Normal"/>
+    <w:link w:val="SubtitleChar"/>
+    <w:uiPriority w:val="11"/>
     <w:qFormat/>
-    <w:rPr>
-      <w:color w:val="2E74B5"/>
-      <w:sz w:val="32"/>
-      <w:szCs w:val="32"/>
-    </w:rPr>
-  </w:style>
-  <w:style w:type="paragraph" w:styleId="Heading2">
-    <w:name w:val="Heading 2"/>
+    <w:pPr>
+      <w:numPr>
+        <w:ilvl w:val="1"/>
+      </w:numPr>
+      <w:spacing w:after="360"/>
+      <w:jc w:val="center"/>
+    </w:pPr>
+    <w:rPr>
+      <w:color w:val="404040"/>
+    </w:rPr>
+  </w:style>
+  <w:style w:type="character" w:customStyle="1" w:styleId="SubtitleChar">
+    <w:name w:val="Subtitle Char"/>
+    <w:basedOn w:val="DefaultParagraphFont"/>
+    <w:link w:val="Subtitle"/>
+    <w:uiPriority w:val="11"/>
+    <w:rPr>
+      <w:rFonts w:ascii="Times New Roman" w:eastAsia="Times New Roman" w:hAnsi="Times New Roman" w:cs="Times New Roman"/>
+      <w:color w:val="404040"/>
+      <w:sz w:val="24"/>
+      <w:szCs w:val="24"/>
+    </w:rPr>
+  </w:style>
+  <w:style w:type="paragraph" w:styleId="Quote">
+    <w:name w:val="Quote"/>
     <w:basedOn w:val="Normal"/>
     <w:next w:val="Normal"/>
+    <w:link w:val="QuoteChar"/>
+    <w:uiPriority w:val="29"/>
     <w:qFormat/>
-    <w:rPr>
-      <w:color w:val="2E74B5"/>
-      <w:sz w:val="26"/>
-      <w:szCs w:val="26"/>
-    </w:rPr>
-  </w:style>
-  <w:style w:type="paragraph" w:styleId="Heading3">
-    <w:name w:val="Heading 3"/>
-    <w:basedOn w:val="Normal"/>
-    <w:next w:val="Normal"/>
-    <w:qFormat/>
-    <w:rPr>
-      <w:color w:val="1F4D78"/>
-      <w:sz w:val="24"/>
-      <w:szCs w:val="24"/>
-    </w:rPr>
-  </w:style>
-  <w:style w:type="paragraph" w:styleId="Heading4">
-    <w:name w:val="Heading 4"/>
-    <w:basedOn w:val="Normal"/>
-    <w:next w:val="Normal"/>
-    <w:qFormat/>
+    <w:pPr>
+      <w:spacing w:before="160"/>
+      <w:jc w:val="center"/>
+    </w:pPr>
     <w:rPr>
       <w:i/>
       <w:iCs/>
-      <w:color w:val="2E74B5"/>
-    </w:rPr>
-  </w:style>
-  <w:style w:type="paragraph" w:styleId="Heading5">
-    <w:name w:val="Heading 5"/>
-    <w:basedOn w:val="Normal"/>
-    <w:next w:val="Normal"/>
-    <w:qFormat/>
-    <w:rPr>
-      <w:color w:val="2E74B5"/>
-    </w:rPr>
-  </w:style>
-  <w:style w:type="paragraph" w:styleId="Heading6">
-    <w:name w:val="Heading 6"/>
-    <w:basedOn w:val="Normal"/>
-    <w:next w:val="Normal"/>
-    <w:qFormat/>
-    <w:rPr>
-      <w:color w:val="1F4D78"/>
-    </w:rPr>
-  </w:style>
-  <w:style w:type="paragraph" w:styleId="Strong">
-    <w:name w:val="Strong"/>
-    <w:basedOn w:val="Normal"/>
-    <w:next w:val="Normal"/>
-    <w:qFormat/>
-    <w:rPr>
-      <w:b/>
-      <w:bCs/>
+      <w:color w:val="404040" w:themeColor="text1" w:themeTint="BF"/>
+    </w:rPr>
+  </w:style>
+  <w:style w:type="character" w:customStyle="1" w:styleId="QuoteChar">
+    <w:name w:val="Quote Char"/>
+    <w:basedOn w:val="DefaultParagraphFont"/>
+    <w:link w:val="Quote"/>
+    <w:uiPriority w:val="29"/>
+    <w:rPr>
+      <w:i/>
+      <w:iCs/>
+      <w:color w:val="404040" w:themeColor="text1" w:themeTint="BF"/>
     </w:rPr>
   </w:style>
   <w:style w:type="paragraph" w:styleId="ListParagraph">
     <w:name w:val="List Paragraph"/>
     <w:basedOn w:val="Normal"/>
+    <w:uiPriority w:val="34"/>
     <w:qFormat/>
+    <w:pPr>
+      <w:ind w:left="720"/>
+      <w:contextualSpacing/>
+    </w:pPr>
+  </w:style>
+  <w:style w:type="character" w:styleId="IntenseEmphasis">
+    <w:name w:val="Intense Emphasis"/>
+    <w:basedOn w:val="DefaultParagraphFont"/>
+    <w:uiPriority w:val="21"/>
+    <w:qFormat/>
+    <w:rPr>
+      <w:i/>
+      <w:iCs/>
+      <w:color w:val="0F4761" w:themeColor="accent1" w:themeShade="BF"/>
+    </w:rPr>
+  </w:style>
+  <w:style w:type="paragraph" w:styleId="IntenseQuote">
+    <w:name w:val="Intense Quote"/>
+    <w:basedOn w:val="Normal"/>
+    <w:next w:val="Normal"/>
+    <w:link w:val="IntenseQuoteChar"/>
+    <w:uiPriority w:val="30"/>
+    <w:qFormat/>
+    <w:pPr>
+      <w:pBdr>
+        <w:top w:val="single" w:sz="4" w:space="10" w:color="0F4761" w:themeColor="accent1" w:themeShade="BF"/>
+        <w:bottom w:val="single" w:sz="4" w:space="10" w:color="0F4761" w:themeColor="accent1" w:themeShade="BF"/>
+      </w:pBdr>
+      <w:spacing w:before="360" w:after="360"/>
+      <w:ind w:left="864" w:right="864"/>
+      <w:jc w:val="center"/>
+    </w:pPr>
+    <w:rPr>
+      <w:i/>
+      <w:iCs/>
+      <w:color w:val="0F4761" w:themeColor="accent1" w:themeShade="BF"/>
+    </w:rPr>
+  </w:style>
+  <w:style w:type="character" w:customStyle="1" w:styleId="IntenseQuoteChar">
+    <w:name w:val="Intense Quote Char"/>
+    <w:basedOn w:val="DefaultParagraphFont"/>
+    <w:link w:val="IntenseQuote"/>
+    <w:uiPriority w:val="30"/>
+    <w:rPr>
+      <w:i/>
+      <w:iCs/>
+      <w:color w:val="0F4761" w:themeColor="accent1" w:themeShade="BF"/>
+    </w:rPr>
+  </w:style>
+  <w:style w:type="character" w:styleId="IntenseReference">
+    <w:name w:val="Intense Reference"/>
+    <w:basedOn w:val="DefaultParagraphFont"/>
+    <w:uiPriority w:val="32"/>
+    <w:qFormat/>
+    <w:rPr>
+      <w:b/>
+      <w:bCs/>
+      <w:smallCaps/>
+      <w:color w:val="0F4761" w:themeColor="accent1" w:themeShade="BF"/>
+      <w:spacing w:val="5"/>
+    </w:rPr>
   </w:style>
   <w:style w:type="character" w:styleId="Hyperlink">
     <w:name w:val="Hyperlink"/>
@@ -3218,13 +3424,29 @@
     <w:uiPriority w:val="99"/>
     <w:unhideWhenUsed/>
     <w:rPr>
-      <w:color w:val="0563C1"/>
+      <w:color w:val="467886" w:themeColor="hyperlink"/>
       <w:u w:val="single"/>
+    </w:rPr>
+  </w:style>
+  <w:style w:type="paragraph" w:styleId="Caption">
+    <w:name w:val="caption"/>
+    <w:basedOn w:val="Normal"/>
+    <w:next w:val="Normal"/>
+    <w:uiPriority w:val="35"/>
+    <w:unhideWhenUsed/>
+    <w:qFormat/>
+    <w:pPr>
+      <w:keepNext/>
+      <w:keepLines/>
+      <w:spacing w:before="120" w:after="80" w:line="240" w:lineRule="auto"/>
+    </w:pPr>
+    <w:rPr>
+      <w:b/>
+      <w:bCs/>
     </w:rPr>
   </w:style>
   <w:style w:type="character" w:styleId="FootnoteReference">
     <w:name w:val="footnote reference"/>
-    <w:basedOn w:val="DefaultParagraphFont"/>
     <w:uiPriority w:val="99"/>
     <w:semiHidden/>
     <w:unhideWhenUsed/>
@@ -3234,22 +3456,17 @@
   </w:style>
   <w:style w:type="paragraph" w:styleId="FootnoteText">
     <w:name w:val="footnote text"/>
-    <w:basedOn w:val="Normal"/>
     <w:link w:val="FootnoteTextChar"/>
     <w:uiPriority w:val="99"/>
     <w:semiHidden/>
     <w:unhideWhenUsed/>
-    <w:pPr>
-      <w:spacing w:after="0" w:line="240" w:lineRule="auto"/>
-    </w:pPr>
     <w:rPr>
       <w:sz w:val="20"/>
       <w:szCs w:val="20"/>
     </w:rPr>
   </w:style>
-  <w:style w:type="character" w:styleId="FootnoteTextChar">
+  <w:style w:type="character" w:customStyle="1" w:styleId="FootnoteTextChar">
     <w:name w:val="Footnote Text Char"/>
-    <w:basedOn w:val="DefaultParagraphFont"/>
     <w:link w:val="FootnoteText"/>
     <w:uiPriority w:val="99"/>
     <w:semiHidden/>
@@ -3261,7 +3478,6 @@
   </w:style>
   <w:style w:type="character" w:styleId="EndnoteReference">
     <w:name w:val="endnote reference"/>
-    <w:basedOn w:val="DefaultParagraphFont"/>
     <w:uiPriority w:val="99"/>
     <w:semiHidden/>
     <w:unhideWhenUsed/>
@@ -3271,22 +3487,17 @@
   </w:style>
   <w:style w:type="paragraph" w:styleId="EndnoteText">
     <w:name w:val="endnote text"/>
-    <w:basedOn w:val="Normal"/>
     <w:link w:val="EndnoteTextChar"/>
     <w:uiPriority w:val="99"/>
     <w:semiHidden/>
     <w:unhideWhenUsed/>
-    <w:pPr>
-      <w:spacing w:after="0" w:line="240" w:lineRule="auto"/>
-    </w:pPr>
     <w:rPr>
       <w:sz w:val="20"/>
       <w:szCs w:val="20"/>
     </w:rPr>
   </w:style>
-  <w:style w:type="character" w:styleId="EndnoteTextChar">
+  <w:style w:type="character" w:customStyle="1" w:styleId="EndnoteTextChar">
     <w:name w:val="Endnote Text Char"/>
-    <w:basedOn w:val="DefaultParagraphFont"/>
     <w:link w:val="EndnoteText"/>
     <w:uiPriority w:val="99"/>
     <w:semiHidden/>
@@ -3296,42 +3507,155 @@
       <w:szCs w:val="20"/>
     </w:rPr>
   </w:style>
-  <w:style w:type="paragraph" w:styleId="Heading1">
-    <w:name w:val="Heading 1"/>
+  <w:style w:type="paragraph" w:customStyle="1" w:styleId="TableText">
+    <w:name w:val="Table Text"/>
     <w:basedOn w:val="Normal"/>
-    <w:next w:val="Normal"/>
+    <w:uiPriority w:val="4"/>
+    <w:qFormat/>
+    <w:pPr>
+      <w:keepLines/>
+      <w:spacing w:after="0" w:line="240" w:lineRule="auto"/>
+    </w:pPr>
+    <w:rPr>
+      <w:sz w:val="22"/>
+      <w:szCs w:val="22"/>
+    </w:rPr>
+  </w:style>
+  <w:style w:type="paragraph" w:customStyle="1" w:styleId="CodeBlock">
+    <w:name w:val="Code Block"/>
+    <w:basedOn w:val="Normal"/>
+    <w:uiPriority w:val="10"/>
+    <w:qFormat/>
+    <w:pPr>
+      <w:keepLines/>
+      <w:suppressAutoHyphens/>
+      <w:spacing w:before="120" w:after="200" w:line="240" w:lineRule="auto"/>
+      <w:ind w:left="284"/>
+      <w:contextualSpacing/>
+    </w:pPr>
+    <w:rPr>
+      <w:rFonts w:ascii="Consolas" w:eastAsia="Consolas" w:hAnsi="Consolas" w:cs="Consolas"/>
+      <w:noProof/>
+      <w:sz w:val="18"/>
+      <w:szCs w:val="18"/>
+    </w:rPr>
+  </w:style>
+  <w:style w:type="table" w:customStyle="1" w:styleId="TableDesign">
+    <w:name w:val="Table Design"/>
+    <w:basedOn w:val="TableNormal"/>
+    <w:uiPriority w:val="4"/>
+    <w:qFormat/>
+    <w:rPr>
+      <w:sz w:val="22"/>
+    </w:rPr>
+    <w:tblPr>
+      <w:tblStyleRowBandSize w:val="1"/>
+      <w:tblBorders>
+        <w:top w:val="single" w:sz="4" w:space="0" w:color="D2DDEB"/>
+        <w:left w:val="single" w:sz="4" w:space="0" w:color="D2DDEB"/>
+        <w:bottom w:val="single" w:sz="4" w:space="0" w:color="D2DDEB"/>
+        <w:right w:val="single" w:sz="4" w:space="0" w:color="D2DDEB"/>
+        <w:insideH w:val="single" w:sz="4" w:space="0" w:color="D2DDEB"/>
+        <w:insideV w:val="single" w:sz="4" w:space="0" w:color="D2DDEB"/>
+      </w:tblBorders>
+      <w:tblCellMar>
+        <w:top w:w="57" w:type="dxa"/>
+        <w:bottom w:w="57" w:type="dxa"/>
+      </w:tblCellMar>
+    </w:tblPr>
+    <w:tcPr>
+      <w:vAlign w:val="center"/>
+    </w:tcPr>
+    <w:tblStylePr w:type="firstRow">
+      <w:rPr>
+        <w:b/>
+        <w:bCs/>
+        <w:color w:val="FFFFFF"/>
+        <w:sz w:val="22"/>
+      </w:rPr>
+      <w:tblPr/>
+      <w:tcPr>
+        <w:tcBorders>
+          <w:top w:val="single" w:sz="4" w:space="0" w:color="D2DDEB"/>
+          <w:left w:val="single" w:sz="4" w:space="0" w:color="D2DDEB"/>
+          <w:bottom w:val="single" w:sz="4" w:space="0" w:color="D2DDEB"/>
+          <w:right w:val="single" w:sz="4" w:space="0" w:color="D2DDEB"/>
+          <w:insideH w:val="single" w:sz="4" w:space="0" w:color="D2DDEB"/>
+          <w:insideV w:val="single" w:sz="4" w:space="0" w:color="D2DDEB"/>
+        </w:tcBorders>
+        <w:shd w:val="clear" w:color="auto" w:fill="475B75"/>
+        <w:vAlign w:val="center"/>
+      </w:tcPr>
+    </w:tblStylePr>
+    <w:tblStylePr w:type="firstCol">
+      <w:tblPr/>
+      <w:tcPr>
+        <w:tcBorders>
+          <w:top w:val="single" w:sz="4" w:space="0" w:color="D2DDEB"/>
+          <w:left w:val="single" w:sz="4" w:space="0" w:color="D2DDEB"/>
+          <w:bottom w:val="single" w:sz="4" w:space="0" w:color="D2DDEB"/>
+          <w:right w:val="single" w:sz="4" w:space="0" w:color="D2DDEB"/>
+          <w:insideH w:val="single" w:sz="4" w:space="0" w:color="D2DDEB"/>
+          <w:insideV w:val="single" w:sz="4" w:space="0" w:color="D2DDEB"/>
+        </w:tcBorders>
+        <w:shd w:val="clear" w:color="auto" w:fill="E6EBF2"/>
+      </w:tcPr>
+    </w:tblStylePr>
+    <w:tblStylePr w:type="band2Horz">
+      <w:tblPr/>
+      <w:tcPr>
+        <w:tcBorders>
+          <w:top w:val="single" w:sz="4" w:space="0" w:color="D2DDEB"/>
+          <w:left w:val="single" w:sz="4" w:space="0" w:color="D2DDEB"/>
+          <w:bottom w:val="single" w:sz="4" w:space="0" w:color="D2DDEB"/>
+          <w:right w:val="single" w:sz="4" w:space="0" w:color="D2DDEB"/>
+          <w:insideH w:val="single" w:sz="4" w:space="0" w:color="D2DDEB"/>
+          <w:insideV w:val="single" w:sz="4" w:space="0" w:color="D2DDEB"/>
+        </w:tcBorders>
+        <w:shd w:val="clear" w:color="auto" w:fill="F8FAFC"/>
+      </w:tcPr>
+    </w:tblStylePr>
+  </w:style>
+  <w:style w:type="character" w:customStyle="1" w:styleId="InlineCode">
+    <w:name w:val="Inline Code"/>
+    <w:basedOn w:val="DefaultParagraphFont"/>
+    <w:uiPriority w:val="10"/>
+    <w:qFormat/>
+    <w:rPr>
+      <w:rFonts w:ascii="Consolas" w:eastAsia="Consolas" w:hAnsi="Consolas" w:cs="Consolas"/>
+      <w:noProof/>
+      <w:sz w:val="20"/>
+      <w:szCs w:val="20"/>
+    </w:rPr>
+  </w:style>
+  <w:style w:type="paragraph" w:customStyle="1" w:styleId="Figure">
+    <w:name w:val="Figure"/>
+    <w:basedOn w:val="Normal"/>
+    <w:next w:val="FigureCaption"/>
+    <w:uiPriority w:val="35"/>
     <w:qFormat/>
     <w:pPr>
       <w:keepNext/>
-      <w:spacing w:after="140" w:before="300"/>
-      <w:outlineLvl w:val="0"/>
+      <w:spacing w:before="160" w:after="60" w:line="240" w:lineRule="auto"/>
+      <w:jc w:val="center"/>
     </w:pPr>
-    <w:rPr>
-      <w:rFonts w:ascii="Times New Roman" w:cs="Times New Roman" w:eastAsia="Times New Roman" w:hAnsi="Times New Roman"/>
-      <w:b/>
-      <w:bCs/>
-      <w:color w:val="1E3547"/>
-      <w:sz w:val="28"/>
-      <w:szCs w:val="28"/>
-    </w:rPr>
-  </w:style>
-  <w:style w:type="paragraph" w:styleId="Heading2">
-    <w:name w:val="Heading 2"/>
-    <w:basedOn w:val="Normal"/>
+  </w:style>
+  <w:style w:type="paragraph" w:customStyle="1" w:styleId="FigureCaption">
+    <w:name w:val="Figure Caption"/>
+    <w:basedOn w:val="Caption"/>
     <w:next w:val="Normal"/>
+    <w:uiPriority w:val="35"/>
     <w:qFormat/>
     <w:pPr>
-      <w:keepNext/>
-      <w:spacing w:after="100" w:before="200"/>
-      <w:outlineLvl w:val="1"/>
+      <w:keepNext w:val="0"/>
+      <w:spacing w:before="0" w:after="200"/>
+      <w:jc w:val="center"/>
     </w:pPr>
     <w:rPr>
-      <w:rFonts w:ascii="Times New Roman" w:cs="Times New Roman" w:eastAsia="Times New Roman" w:hAnsi="Times New Roman"/>
-      <w:b/>
-      <w:bCs/>
-      <w:color w:val="35617D"/>
-      <w:sz w:val="24"/>
-      <w:szCs w:val="24"/>
+      <w:b w:val="0"/>
+      <w:bCs w:val="0"/>
+      <w:sz w:val="22"/>
+      <w:szCs w:val="22"/>
     </w:rPr>
   </w:style>
 </w:styles>

</xml_diff>